<commit_message>
docs: Actualización de casos de uso
</commit_message>
<xml_diff>
--- a/_docs_/trim2/02_Casos_de_Uso/Descripción de Caso de Uso_ImpactoFS.docx
+++ b/_docs_/trim2/02_Casos_de_Uso/Descripción de Caso de Uso_ImpactoFS.docx
@@ -271,8 +271,22 @@
               <w:t>admin</w:t>
             </w:r>
             <w:proofErr w:type="spellEnd"/>
-            <w:r>
-              <w:t>), Vendedor (</w:t>
+            <w:proofErr w:type="gramStart"/>
+            <w:r>
+              <w:t xml:space="preserve">), </w:t>
+            </w:r>
+            <w:r>
+              <w:t xml:space="preserve"> </w:t>
+            </w:r>
+            <w:r>
+              <w:t>Moderador</w:t>
+            </w:r>
+            <w:proofErr w:type="gramEnd"/>
+            <w:r>
+              <w:t xml:space="preserve"> </w:t>
+            </w:r>
+            <w:r>
+              <w:t>(</w:t>
             </w:r>
             <w:proofErr w:type="spellStart"/>
             <w:r>
@@ -2634,8 +2648,22 @@
               <w:t>admin</w:t>
             </w:r>
             <w:proofErr w:type="spellEnd"/>
-            <w:r>
-              <w:t>), Vendedor (</w:t>
+            <w:proofErr w:type="gramStart"/>
+            <w:r>
+              <w:t xml:space="preserve">), </w:t>
+            </w:r>
+            <w:r>
+              <w:t xml:space="preserve"> </w:t>
+            </w:r>
+            <w:r>
+              <w:t>Moderador</w:t>
+            </w:r>
+            <w:proofErr w:type="gramEnd"/>
+            <w:r>
+              <w:t xml:space="preserve"> </w:t>
+            </w:r>
+            <w:r>
+              <w:t>(</w:t>
             </w:r>
             <w:proofErr w:type="spellStart"/>
             <w:r>
@@ -4658,8 +4686,22 @@
               <w:t>admin</w:t>
             </w:r>
             <w:proofErr w:type="spellEnd"/>
-            <w:r>
-              <w:t>), Vendedor (</w:t>
+            <w:proofErr w:type="gramStart"/>
+            <w:r>
+              <w:t xml:space="preserve">), </w:t>
+            </w:r>
+            <w:r>
+              <w:t xml:space="preserve"> </w:t>
+            </w:r>
+            <w:r>
+              <w:t>Moderador</w:t>
+            </w:r>
+            <w:proofErr w:type="gramEnd"/>
+            <w:r>
+              <w:t xml:space="preserve"> </w:t>
+            </w:r>
+            <w:r>
+              <w:t>(</w:t>
             </w:r>
             <w:proofErr w:type="spellStart"/>
             <w:r>
@@ -6465,8 +6507,22 @@
               <w:t>admin</w:t>
             </w:r>
             <w:proofErr w:type="spellEnd"/>
-            <w:r>
-              <w:t>), Vendedor (</w:t>
+            <w:proofErr w:type="gramStart"/>
+            <w:r>
+              <w:t xml:space="preserve">), </w:t>
+            </w:r>
+            <w:r>
+              <w:t xml:space="preserve"> </w:t>
+            </w:r>
+            <w:r>
+              <w:t>Moderador</w:t>
+            </w:r>
+            <w:proofErr w:type="gramEnd"/>
+            <w:r>
+              <w:t xml:space="preserve"> </w:t>
+            </w:r>
+            <w:r>
+              <w:t>(</w:t>
             </w:r>
             <w:proofErr w:type="spellStart"/>
             <w:r>
@@ -8090,8 +8146,9 @@
             <w:r>
               <w:rPr>
                 <w:b/>
-              </w:rPr>
-              <w:t>Inscripción a torneos</w:t>
+                <w:bCs/>
+              </w:rPr>
+              <w:t xml:space="preserve">Inscripción a Torneos </w:t>
             </w:r>
           </w:p>
         </w:tc>
@@ -8164,7 +8221,67 @@
                 <w:szCs w:val="23"/>
                 <w:shd w:val="clear" w:color="auto" w:fill="FFFFFF"/>
               </w:rPr>
-              <w:t>El administrador inscribe uno o varios equipos (internos o externos) en un torneo ya creado, asignándoles grupo o fase inicial.</w:t>
+              <w:t>El administrador inscribe uno o varios equipos en un torneo ya creado. </w:t>
+            </w:r>
+            <w:r>
+              <w:rPr>
+                <w:b/>
+                <w:bCs/>
+                <w:color w:val="0F1115"/>
+                <w:sz w:val="23"/>
+                <w:szCs w:val="23"/>
+                <w:shd w:val="clear" w:color="auto" w:fill="FFFFFF"/>
+              </w:rPr>
+              <w:t>Este caso de uso no está implementado en el código actual.</w:t>
+            </w:r>
+            <w:r>
+              <w:rPr>
+                <w:color w:val="0F1115"/>
+                <w:sz w:val="23"/>
+                <w:szCs w:val="23"/>
+                <w:shd w:val="clear" w:color="auto" w:fill="FFFFFF"/>
+              </w:rPr>
+              <w:t xml:space="preserve"> El </w:t>
+            </w:r>
+            <w:proofErr w:type="spellStart"/>
+            <w:r>
+              <w:rPr>
+                <w:color w:val="0F1115"/>
+                <w:sz w:val="23"/>
+                <w:szCs w:val="23"/>
+                <w:shd w:val="clear" w:color="auto" w:fill="FFFFFF"/>
+              </w:rPr>
+              <w:t>backend</w:t>
+            </w:r>
+            <w:proofErr w:type="spellEnd"/>
+            <w:r>
+              <w:rPr>
+                <w:color w:val="0F1115"/>
+                <w:sz w:val="23"/>
+                <w:szCs w:val="23"/>
+                <w:shd w:val="clear" w:color="auto" w:fill="FFFFFF"/>
+              </w:rPr>
+              <w:t xml:space="preserve"> no tiene </w:t>
+            </w:r>
+            <w:proofErr w:type="spellStart"/>
+            <w:r>
+              <w:rPr>
+                <w:color w:val="0F1115"/>
+                <w:sz w:val="23"/>
+                <w:szCs w:val="23"/>
+                <w:shd w:val="clear" w:color="auto" w:fill="FFFFFF"/>
+              </w:rPr>
+              <w:t>endpoints</w:t>
+            </w:r>
+            <w:proofErr w:type="spellEnd"/>
+            <w:r>
+              <w:rPr>
+                <w:color w:val="0F1115"/>
+                <w:sz w:val="23"/>
+                <w:szCs w:val="23"/>
+                <w:shd w:val="clear" w:color="auto" w:fill="FFFFFF"/>
+              </w:rPr>
+              <w:t xml:space="preserve"> para gestionar la relación entre torneos y equipos. Los equipos se generan aleatoriamente, pero no se persisten en la base de datos.</w:t>
             </w:r>
           </w:p>
         </w:tc>
@@ -8231,7 +8348,29 @@
               <w:spacing w:line="240" w:lineRule="auto"/>
             </w:pPr>
             <w:r>
-              <w:t>Administrador</w:t>
+              <w:t>Administrador (</w:t>
+            </w:r>
+            <w:proofErr w:type="spellStart"/>
+            <w:r>
+              <w:t>admin</w:t>
+            </w:r>
+            <w:proofErr w:type="spellEnd"/>
+            <w:r>
+              <w:t xml:space="preserve">), </w:t>
+            </w:r>
+            <w:r>
+              <w:t>Moderador</w:t>
+            </w:r>
+            <w:r>
+              <w:t xml:space="preserve"> (</w:t>
+            </w:r>
+            <w:proofErr w:type="spellStart"/>
+            <w:r>
+              <w:t>seller</w:t>
+            </w:r>
+            <w:proofErr w:type="spellEnd"/>
+            <w:r>
+              <w:t>)</w:t>
             </w:r>
           </w:p>
         </w:tc>
@@ -8333,34 +8472,58 @@
                 <w:color w:val="0F1115"/>
                 <w:sz w:val="23"/>
                 <w:szCs w:val="23"/>
+                <w:shd w:val="clear" w:color="auto" w:fill="FFFFFF"/>
               </w:rPr>
               <w:br/>
-            </w:r>
-            <w:r>
-              <w:rPr>
-                <w:color w:val="0F1115"/>
-                <w:sz w:val="23"/>
-                <w:szCs w:val="23"/>
-                <w:shd w:val="clear" w:color="auto" w:fill="FFFFFF"/>
-              </w:rPr>
-              <w:t>2. Existe un torneo creado y en estado "Inscripciones Abiertas".</w:t>
-            </w:r>
-            <w:r>
-              <w:rPr>
-                <w:color w:val="0F1115"/>
-                <w:sz w:val="23"/>
-                <w:szCs w:val="23"/>
+              <w:t>2. Existe un torneo creado en la tabla </w:t>
+            </w:r>
+            <w:proofErr w:type="spellStart"/>
+            <w:r>
+              <w:rPr>
+                <w:color w:val="0F1115"/>
+                <w:sz w:val="23"/>
+                <w:szCs w:val="23"/>
+                <w:shd w:val="clear" w:color="auto" w:fill="FFFFFF"/>
+              </w:rPr>
+              <w:t>tournaments</w:t>
+            </w:r>
+            <w:proofErr w:type="spellEnd"/>
+            <w:r>
+              <w:rPr>
+                <w:color w:val="0F1115"/>
+                <w:sz w:val="23"/>
+                <w:szCs w:val="23"/>
+                <w:shd w:val="clear" w:color="auto" w:fill="FFFFFF"/>
+              </w:rPr>
+              <w:t>.</w:t>
+            </w:r>
+            <w:r>
+              <w:rPr>
+                <w:color w:val="0F1115"/>
+                <w:sz w:val="23"/>
+                <w:szCs w:val="23"/>
+                <w:shd w:val="clear" w:color="auto" w:fill="FFFFFF"/>
               </w:rPr>
               <w:br/>
-            </w:r>
-            <w:r>
-              <w:rPr>
-                <w:color w:val="0F1115"/>
-                <w:sz w:val="23"/>
-                <w:szCs w:val="23"/>
-                <w:shd w:val="clear" w:color="auto" w:fill="FFFFFF"/>
-              </w:rPr>
-              <w:t>3. Los equipos a inscribir están registrados en el sistema.</w:t>
+              <w:t xml:space="preserve">3. </w:t>
+            </w:r>
+            <w:r>
+              <w:rPr>
+                <w:color w:val="0F1115"/>
+                <w:sz w:val="23"/>
+                <w:szCs w:val="23"/>
+                <w:shd w:val="clear" w:color="auto" w:fill="FFFFFF"/>
+              </w:rPr>
+              <w:t>Los equipos por inscribir</w:t>
+            </w:r>
+            <w:r>
+              <w:rPr>
+                <w:color w:val="0F1115"/>
+                <w:sz w:val="23"/>
+                <w:szCs w:val="23"/>
+                <w:shd w:val="clear" w:color="auto" w:fill="FFFFFF"/>
+              </w:rPr>
+              <w:t xml:space="preserve"> están registrados en el sistema (no hay tabla de equipos).</w:t>
             </w:r>
           </w:p>
         </w:tc>
@@ -8426,41 +8589,37 @@
                 <w:szCs w:val="23"/>
                 <w:shd w:val="clear" w:color="auto" w:fill="FFFFFF"/>
               </w:rPr>
-              <w:t>1. Los equipos quedan oficialmente inscritos en el torneo.</w:t>
-            </w:r>
-            <w:r>
-              <w:rPr>
-                <w:color w:val="0F1115"/>
-                <w:sz w:val="23"/>
-                <w:szCs w:val="23"/>
+              <w:t>1. Los equipos quedarían oficialmente inscritos en el torneo (requiere una tabla </w:t>
+            </w:r>
+            <w:proofErr w:type="spellStart"/>
+            <w:r>
+              <w:rPr>
+                <w:color w:val="0F1115"/>
+                <w:sz w:val="23"/>
+                <w:szCs w:val="23"/>
+                <w:shd w:val="clear" w:color="auto" w:fill="FFFFFF"/>
+              </w:rPr>
+              <w:t>tournament_teams</w:t>
+            </w:r>
+            <w:proofErr w:type="spellEnd"/>
+            <w:r>
+              <w:rPr>
+                <w:color w:val="0F1115"/>
+                <w:sz w:val="23"/>
+                <w:szCs w:val="23"/>
+                <w:shd w:val="clear" w:color="auto" w:fill="FFFFFF"/>
+              </w:rPr>
+              <w:t>).</w:t>
+            </w:r>
+            <w:r>
+              <w:rPr>
+                <w:color w:val="0F1115"/>
+                <w:sz w:val="23"/>
+                <w:szCs w:val="23"/>
+                <w:shd w:val="clear" w:color="auto" w:fill="FFFFFF"/>
               </w:rPr>
               <w:br/>
-            </w:r>
-            <w:r>
-              <w:rPr>
-                <w:color w:val="0F1115"/>
-                <w:sz w:val="23"/>
-                <w:szCs w:val="23"/>
-                <w:shd w:val="clear" w:color="auto" w:fill="FFFFFF"/>
-              </w:rPr>
               <w:t>2. Se actualiza la lista de participantes del torneo.</w:t>
-            </w:r>
-            <w:r>
-              <w:rPr>
-                <w:color w:val="0F1115"/>
-                <w:sz w:val="23"/>
-                <w:szCs w:val="23"/>
-              </w:rPr>
-              <w:br/>
-            </w:r>
-            <w:r>
-              <w:rPr>
-                <w:color w:val="0F1115"/>
-                <w:sz w:val="23"/>
-                <w:szCs w:val="23"/>
-                <w:shd w:val="clear" w:color="auto" w:fill="FFFFFF"/>
-              </w:rPr>
-              <w:t>3. Se notifica al administrador el éxito de la inscripción.</w:t>
             </w:r>
           </w:p>
         </w:tc>
@@ -9420,7 +9579,11 @@
               <w:spacing w:line="360" w:lineRule="auto"/>
             </w:pPr>
             <w:r>
-              <w:t xml:space="preserve">El sistema mostrará un formulario extra al lado de la lista de equipos internos con Nombre, Categoría (con </w:t>
+              <w:t xml:space="preserve">El sistema mostrará un formulario extra al lado de la lista de equipos internos con </w:t>
+            </w:r>
+            <w:r>
+              <w:lastRenderedPageBreak/>
+              <w:t xml:space="preserve">Nombre, Categoría (con </w:t>
             </w:r>
             <w:proofErr w:type="spellStart"/>
             <w:r>
@@ -9439,7 +9602,6 @@
               <w:t xml:space="preserve"> de años desde el 2007 hasta 2012), Escuela y </w:t>
             </w:r>
             <w:r>
-              <w:lastRenderedPageBreak/>
               <w:t>C</w:t>
             </w:r>
             <w:r>
@@ -9485,6 +9647,7 @@
               <w:rPr>
                 <w:b/>
               </w:rPr>
+              <w:lastRenderedPageBreak/>
               <w:t>Rendimiento</w:t>
             </w:r>
           </w:p>
@@ -9519,7 +9682,7 @@
                 <w:szCs w:val="23"/>
                 <w:shd w:val="clear" w:color="auto" w:fill="FFFFFF"/>
               </w:rPr>
-              <w:t>La inscripción de un equipo debe tomar menos de 3 segundos.</w:t>
+              <w:t>La inscripción debe tomar menos de 3 segundos.</w:t>
             </w:r>
           </w:p>
         </w:tc>
@@ -9592,7 +9755,7 @@
                 <w:szCs w:val="23"/>
                 <w:shd w:val="clear" w:color="auto" w:fill="FFFFFF"/>
               </w:rPr>
-              <w:t>Este caso de uso se espera que se lleve a cabo una media de 3 a 5 veces por torneo.</w:t>
+              <w:t>Media de 3 a 5 veces por torneo.</w:t>
             </w:r>
           </w:p>
         </w:tc>
@@ -9813,12 +9976,145 @@
             </w:pPr>
             <w:r>
               <w:rPr>
-                <w:color w:val="0F1115"/>
-                <w:sz w:val="23"/>
-                <w:szCs w:val="23"/>
-                <w:shd w:val="clear" w:color="auto" w:fill="FFFFFF"/>
-              </w:rPr>
-              <w:t>No aplica.</w:t>
+                <w:b/>
+                <w:bCs/>
+                <w:color w:val="0F1115"/>
+                <w:sz w:val="23"/>
+                <w:szCs w:val="23"/>
+                <w:shd w:val="clear" w:color="auto" w:fill="FFFFFF"/>
+              </w:rPr>
+              <w:t>Pendiente de implementación.</w:t>
+            </w:r>
+            <w:r>
+              <w:rPr>
+                <w:color w:val="0F1115"/>
+                <w:sz w:val="23"/>
+                <w:szCs w:val="23"/>
+                <w:shd w:val="clear" w:color="auto" w:fill="FFFFFF"/>
+              </w:rPr>
+              <w:t> Se necesita crear una tabla </w:t>
+            </w:r>
+            <w:proofErr w:type="spellStart"/>
+            <w:r>
+              <w:rPr>
+                <w:color w:val="0F1115"/>
+                <w:sz w:val="23"/>
+                <w:szCs w:val="23"/>
+                <w:shd w:val="clear" w:color="auto" w:fill="FFFFFF"/>
+              </w:rPr>
+              <w:t>tournament_teams</w:t>
+            </w:r>
+            <w:proofErr w:type="spellEnd"/>
+            <w:r>
+              <w:rPr>
+                <w:color w:val="0F1115"/>
+                <w:sz w:val="23"/>
+                <w:szCs w:val="23"/>
+                <w:shd w:val="clear" w:color="auto" w:fill="FFFFFF"/>
+              </w:rPr>
+              <w:t xml:space="preserve"> para almacenar la relación y un </w:t>
+            </w:r>
+            <w:proofErr w:type="spellStart"/>
+            <w:r>
+              <w:rPr>
+                <w:color w:val="0F1115"/>
+                <w:sz w:val="23"/>
+                <w:szCs w:val="23"/>
+                <w:shd w:val="clear" w:color="auto" w:fill="FFFFFF"/>
+              </w:rPr>
+              <w:t>endpoint</w:t>
+            </w:r>
+            <w:proofErr w:type="spellEnd"/>
+            <w:r>
+              <w:rPr>
+                <w:color w:val="0F1115"/>
+                <w:sz w:val="23"/>
+                <w:szCs w:val="23"/>
+                <w:shd w:val="clear" w:color="auto" w:fill="FFFFFF"/>
+              </w:rPr>
+              <w:t> /api/</w:t>
+            </w:r>
+            <w:proofErr w:type="spellStart"/>
+            <w:r>
+              <w:rPr>
+                <w:color w:val="0F1115"/>
+                <w:sz w:val="23"/>
+                <w:szCs w:val="23"/>
+                <w:shd w:val="clear" w:color="auto" w:fill="FFFFFF"/>
+              </w:rPr>
+              <w:t>tournaments</w:t>
+            </w:r>
+            <w:proofErr w:type="spellEnd"/>
+            <w:proofErr w:type="gramStart"/>
+            <w:r>
+              <w:rPr>
+                <w:color w:val="0F1115"/>
+                <w:sz w:val="23"/>
+                <w:szCs w:val="23"/>
+                <w:shd w:val="clear" w:color="auto" w:fill="FFFFFF"/>
+              </w:rPr>
+              <w:t>/:</w:t>
+            </w:r>
+            <w:proofErr w:type="spellStart"/>
+            <w:r>
+              <w:rPr>
+                <w:color w:val="0F1115"/>
+                <w:sz w:val="23"/>
+                <w:szCs w:val="23"/>
+                <w:shd w:val="clear" w:color="auto" w:fill="FFFFFF"/>
+              </w:rPr>
+              <w:t>tournamentId</w:t>
+            </w:r>
+            <w:proofErr w:type="spellEnd"/>
+            <w:proofErr w:type="gramEnd"/>
+            <w:r>
+              <w:rPr>
+                <w:color w:val="0F1115"/>
+                <w:sz w:val="23"/>
+                <w:szCs w:val="23"/>
+                <w:shd w:val="clear" w:color="auto" w:fill="FFFFFF"/>
+              </w:rPr>
+              <w:t>/</w:t>
+            </w:r>
+            <w:proofErr w:type="spellStart"/>
+            <w:r>
+              <w:rPr>
+                <w:color w:val="0F1115"/>
+                <w:sz w:val="23"/>
+                <w:szCs w:val="23"/>
+                <w:shd w:val="clear" w:color="auto" w:fill="FFFFFF"/>
+              </w:rPr>
+              <w:t>teams</w:t>
+            </w:r>
+            <w:proofErr w:type="spellEnd"/>
+            <w:r>
+              <w:rPr>
+                <w:color w:val="0F1115"/>
+                <w:sz w:val="23"/>
+                <w:szCs w:val="23"/>
+                <w:shd w:val="clear" w:color="auto" w:fill="FFFFFF"/>
+              </w:rPr>
+              <w:t> para gestionar las inscripciones. La generación aleatoria de equipos (</w:t>
+            </w:r>
+            <w:proofErr w:type="spellStart"/>
+            <w:r>
+              <w:rPr>
+                <w:color w:val="0F1115"/>
+                <w:sz w:val="23"/>
+                <w:szCs w:val="23"/>
+                <w:shd w:val="clear" w:color="auto" w:fill="FFFFFF"/>
+              </w:rPr>
+              <w:t>generateRandomTeams</w:t>
+            </w:r>
+            <w:proofErr w:type="spellEnd"/>
+            <w:r>
+              <w:rPr>
+                <w:color w:val="0F1115"/>
+                <w:sz w:val="23"/>
+                <w:szCs w:val="23"/>
+                <w:shd w:val="clear" w:color="auto" w:fill="FFFFFF"/>
+              </w:rPr>
+              <w:t>) es un paso previo, pero los equipos generados no se guardan.</w:t>
             </w:r>
           </w:p>
         </w:tc>
@@ -9843,8 +10139,8 @@
       </w:tblPr>
       <w:tblGrid>
         <w:gridCol w:w="1770"/>
-        <w:gridCol w:w="450"/>
-        <w:gridCol w:w="4200"/>
+        <w:gridCol w:w="630"/>
+        <w:gridCol w:w="4020"/>
         <w:gridCol w:w="4680"/>
       </w:tblGrid>
       <w:tr>
@@ -9922,8 +10218,25 @@
             <w:r>
               <w:rPr>
                 <w:b/>
-              </w:rPr>
-              <w:t>Administrar Productos del catálogo</w:t>
+                <w:bCs/>
+              </w:rPr>
+              <w:t>Administrar Productos del Catálogo (</w:t>
+            </w:r>
+            <w:proofErr w:type="spellStart"/>
+            <w:r>
+              <w:rPr>
+                <w:b/>
+                <w:bCs/>
+              </w:rPr>
+              <w:t>Admin</w:t>
+            </w:r>
+            <w:proofErr w:type="spellEnd"/>
+            <w:r>
+              <w:rPr>
+                <w:b/>
+                <w:bCs/>
+              </w:rPr>
+              <w:t>/Seller)</w:t>
             </w:r>
           </w:p>
         </w:tc>
@@ -9996,7 +10309,25 @@
                 <w:szCs w:val="23"/>
                 <w:shd w:val="clear" w:color="auto" w:fill="FFFFFF"/>
               </w:rPr>
-              <w:t>El administrador agrega, edita o elimina productos del catálogo virtual con imagen, descripción y precio. Los usuarios solo pueden verlos y contactar vía WhatsApp para compra.</w:t>
+              <w:t xml:space="preserve">El administrador o </w:t>
+            </w:r>
+            <w:r>
+              <w:rPr>
+                <w:color w:val="0F1115"/>
+                <w:sz w:val="23"/>
+                <w:szCs w:val="23"/>
+                <w:shd w:val="clear" w:color="auto" w:fill="FFFFFF"/>
+              </w:rPr>
+              <w:t>Moderador</w:t>
+            </w:r>
+            <w:r>
+              <w:rPr>
+                <w:color w:val="0F1115"/>
+                <w:sz w:val="23"/>
+                <w:szCs w:val="23"/>
+                <w:shd w:val="clear" w:color="auto" w:fill="FFFFFF"/>
+              </w:rPr>
+              <w:t xml:space="preserve"> agrega, edita o elimina productos del catálogo virtual en la tabla productos, con imagen, descripción, precio y stock. Los usuarios (público) pueden verlos y contactar vía WhatsApp para compra.</w:t>
             </w:r>
           </w:p>
         </w:tc>
@@ -10063,7 +10394,32 @@
               <w:spacing w:line="240" w:lineRule="auto"/>
             </w:pPr>
             <w:r>
-              <w:t>Administrador</w:t>
+              <w:t>Administrador (</w:t>
+            </w:r>
+            <w:proofErr w:type="spellStart"/>
+            <w:r>
+              <w:t>admin</w:t>
+            </w:r>
+            <w:proofErr w:type="spellEnd"/>
+            <w:r>
+              <w:t xml:space="preserve">), </w:t>
+            </w:r>
+            <w:r>
+              <w:t>Moderador</w:t>
+            </w:r>
+            <w:r>
+              <w:t xml:space="preserve"> </w:t>
+            </w:r>
+            <w:r>
+              <w:t>(</w:t>
+            </w:r>
+            <w:proofErr w:type="spellStart"/>
+            <w:r>
+              <w:t>seller</w:t>
+            </w:r>
+            <w:proofErr w:type="spellEnd"/>
+            <w:r>
+              <w:t>)</w:t>
             </w:r>
           </w:p>
         </w:tc>
@@ -10158,7 +10514,7 @@
                 <w:szCs w:val="23"/>
                 <w:shd w:val="clear" w:color="auto" w:fill="FFFFFF"/>
               </w:rPr>
-              <w:t>1. El administrador ha iniciado sesión.</w:t>
+              <w:t>1. El usuario ha iniciado sesión (token válido).</w:t>
             </w:r>
           </w:p>
         </w:tc>
@@ -10224,24 +10580,7 @@
                 <w:szCs w:val="23"/>
                 <w:shd w:val="clear" w:color="auto" w:fill="FFFFFF"/>
               </w:rPr>
-              <w:t>1. El catálogo se actualiza y es visible en la sección pública de la tienda.</w:t>
-            </w:r>
-            <w:r>
-              <w:rPr>
-                <w:color w:val="0F1115"/>
-                <w:sz w:val="23"/>
-                <w:szCs w:val="23"/>
-              </w:rPr>
-              <w:br/>
-            </w:r>
-            <w:r>
-              <w:rPr>
-                <w:color w:val="0F1115"/>
-                <w:sz w:val="23"/>
-                <w:szCs w:val="23"/>
-                <w:shd w:val="clear" w:color="auto" w:fill="FFFFFF"/>
-              </w:rPr>
-              <w:t>2. Cada producto tiene un enlace preconfigurado para compartir por WhatsApp.</w:t>
+              <w:t>1. El catálogo se actualiza en la tabla productos y es visible en la sección pública (/catalogo).</w:t>
             </w:r>
           </w:p>
         </w:tc>
@@ -10287,7 +10626,7 @@
         </w:tc>
         <w:tc>
           <w:tcPr>
-            <w:tcW w:w="450" w:type="dxa"/>
+            <w:tcW w:w="630" w:type="dxa"/>
             <w:shd w:val="clear" w:color="auto" w:fill="D9EAD3"/>
             <w:tcMar>
               <w:top w:w="100" w:type="dxa"/>
@@ -10321,7 +10660,7 @@
         </w:tc>
         <w:tc>
           <w:tcPr>
-            <w:tcW w:w="4200" w:type="dxa"/>
+            <w:tcW w:w="4020" w:type="dxa"/>
             <w:shd w:val="clear" w:color="auto" w:fill="D9EAD3"/>
             <w:tcMar>
               <w:top w:w="100" w:type="dxa"/>
@@ -10406,7 +10745,7 @@
         </w:tc>
         <w:tc>
           <w:tcPr>
-            <w:tcW w:w="450" w:type="dxa"/>
+            <w:tcW w:w="630" w:type="dxa"/>
             <w:tcMar>
               <w:top w:w="100" w:type="dxa"/>
               <w:left w:w="100" w:type="dxa"/>
@@ -10433,7 +10772,7 @@
         </w:tc>
         <w:tc>
           <w:tcPr>
-            <w:tcW w:w="4200" w:type="dxa"/>
+            <w:tcW w:w="4020" w:type="dxa"/>
             <w:tcMar>
               <w:top w:w="100" w:type="dxa"/>
               <w:left w:w="100" w:type="dxa"/>
@@ -10454,7 +10793,7 @@
               <w:spacing w:line="360" w:lineRule="auto"/>
             </w:pPr>
             <w:r>
-              <w:t>El administrador selecciona "Catálogo".</w:t>
+              <w:t>El usuario selecciona "Productos" desde el panel de administración.</w:t>
             </w:r>
           </w:p>
         </w:tc>
@@ -10481,13 +10820,15 @@
               <w:spacing w:line="360" w:lineRule="auto"/>
             </w:pPr>
             <w:r>
-              <w:t>El sistema muestra lista de productos con imagen, precio, stock y botones de acción</w:t>
-            </w:r>
-            <w:r>
-              <w:t>, la lista estará vacía hasta que agregue mínimo un producto</w:t>
-            </w:r>
-            <w:r>
-              <w:t>.</w:t>
+              <w:t>El sistema realiza una solicitud GET a /api/</w:t>
+            </w:r>
+            <w:proofErr w:type="spellStart"/>
+            <w:r>
+              <w:t>products</w:t>
+            </w:r>
+            <w:proofErr w:type="spellEnd"/>
+            <w:r>
+              <w:t> y muestra la lista de productos con imagen, precio, stock y botones de acción.</w:t>
             </w:r>
           </w:p>
         </w:tc>
@@ -10524,7 +10865,7 @@
         </w:tc>
         <w:tc>
           <w:tcPr>
-            <w:tcW w:w="450" w:type="dxa"/>
+            <w:tcW w:w="630" w:type="dxa"/>
             <w:tcMar>
               <w:top w:w="100" w:type="dxa"/>
               <w:left w:w="100" w:type="dxa"/>
@@ -10551,7 +10892,7 @@
         </w:tc>
         <w:tc>
           <w:tcPr>
-            <w:tcW w:w="4200" w:type="dxa"/>
+            <w:tcW w:w="4020" w:type="dxa"/>
             <w:tcMar>
               <w:top w:w="100" w:type="dxa"/>
               <w:left w:w="100" w:type="dxa"/>
@@ -10572,7 +10913,7 @@
               <w:spacing w:line="360" w:lineRule="auto"/>
             </w:pPr>
             <w:r>
-              <w:t>El administrador hace clic en "Agregar Producto".</w:t>
+              <w:t>El usuario hace clic en "Agregar Producto".</w:t>
             </w:r>
           </w:p>
         </w:tc>
@@ -10599,7 +10940,7 @@
               <w:spacing w:line="360" w:lineRule="auto"/>
             </w:pPr>
             <w:r>
-              <w:t>El sistema muestra formulario con campos: nombre, descripción, precio, imagen, categoría, stock.</w:t>
+              <w:t>El sistema muestra un formulario (modal) con campos: nombre, descripcion, precio, stock, imagen (URL), categoria.</w:t>
             </w:r>
           </w:p>
         </w:tc>
@@ -10636,7 +10977,7 @@
         </w:tc>
         <w:tc>
           <w:tcPr>
-            <w:tcW w:w="450" w:type="dxa"/>
+            <w:tcW w:w="630" w:type="dxa"/>
             <w:tcMar>
               <w:top w:w="100" w:type="dxa"/>
               <w:left w:w="100" w:type="dxa"/>
@@ -10663,7 +11004,7 @@
         </w:tc>
         <w:tc>
           <w:tcPr>
-            <w:tcW w:w="4200" w:type="dxa"/>
+            <w:tcW w:w="4020" w:type="dxa"/>
             <w:tcMar>
               <w:top w:w="100" w:type="dxa"/>
               <w:left w:w="100" w:type="dxa"/>
@@ -10754,50 +11095,46 @@
         </w:tc>
         <w:tc>
           <w:tcPr>
-            <w:tcW w:w="450" w:type="dxa"/>
-            <w:tcMar>
-              <w:top w:w="100" w:type="dxa"/>
-              <w:left w:w="100" w:type="dxa"/>
-              <w:bottom w:w="100" w:type="dxa"/>
-              <w:right w:w="100" w:type="dxa"/>
-            </w:tcMar>
-          </w:tcPr>
-          <w:p>
-            <w:pPr>
-              <w:widowControl w:val="0"/>
-              <w:pBdr>
-                <w:top w:val="nil"/>
-                <w:left w:val="nil"/>
-                <w:bottom w:val="nil"/>
-                <w:right w:val="nil"/>
-                <w:between w:val="nil"/>
-              </w:pBdr>
-              <w:spacing w:line="240" w:lineRule="auto"/>
-            </w:pPr>
-          </w:p>
-        </w:tc>
-        <w:tc>
-          <w:tcPr>
-            <w:tcW w:w="4200" w:type="dxa"/>
-            <w:tcMar>
-              <w:top w:w="100" w:type="dxa"/>
-              <w:left w:w="100" w:type="dxa"/>
-              <w:bottom w:w="100" w:type="dxa"/>
-              <w:right w:w="100" w:type="dxa"/>
-            </w:tcMar>
-          </w:tcPr>
-          <w:p>
-            <w:pPr>
-              <w:widowControl w:val="0"/>
-              <w:numPr>
-                <w:ilvl w:val="0"/>
-                <w:numId w:val="1"/>
-              </w:numPr>
+            <w:tcW w:w="630" w:type="dxa"/>
+            <w:tcMar>
+              <w:top w:w="100" w:type="dxa"/>
+              <w:left w:w="100" w:type="dxa"/>
+              <w:bottom w:w="100" w:type="dxa"/>
+              <w:right w:w="100" w:type="dxa"/>
+            </w:tcMar>
+          </w:tcPr>
+          <w:p>
+            <w:pPr>
+              <w:widowControl w:val="0"/>
+              <w:pBdr>
+                <w:top w:val="nil"/>
+                <w:left w:val="nil"/>
+                <w:bottom w:val="nil"/>
+                <w:right w:val="nil"/>
+                <w:between w:val="nil"/>
+              </w:pBdr>
+              <w:spacing w:line="240" w:lineRule="auto"/>
+            </w:pPr>
+            <w:r>
+              <w:t>3.1</w:t>
+            </w:r>
+          </w:p>
+        </w:tc>
+        <w:tc>
+          <w:tcPr>
+            <w:tcW w:w="4020" w:type="dxa"/>
+            <w:tcMar>
+              <w:top w:w="100" w:type="dxa"/>
+              <w:left w:w="100" w:type="dxa"/>
+              <w:bottom w:w="100" w:type="dxa"/>
+              <w:right w:w="100" w:type="dxa"/>
+            </w:tcMar>
+          </w:tcPr>
+          <w:p>
+            <w:pPr>
+              <w:widowControl w:val="0"/>
               <w:spacing w:line="360" w:lineRule="auto"/>
             </w:pPr>
-            <w:r>
-              <w:t>3.1 Si la imagen no cumple formato o peso, el sistema deberá rechazar la imagen, mostrar especificaciones requeridas.</w:t>
-            </w:r>
           </w:p>
         </w:tc>
         <w:tc>
@@ -10813,10 +11150,6 @@
           <w:p>
             <w:pPr>
               <w:widowControl w:val="0"/>
-              <w:numPr>
-                <w:ilvl w:val="0"/>
-                <w:numId w:val="1"/>
-              </w:numPr>
               <w:pBdr>
                 <w:top w:val="nil"/>
                 <w:left w:val="nil"/>
@@ -10827,7 +11160,15 @@
               <w:spacing w:line="360" w:lineRule="auto"/>
             </w:pPr>
             <w:r>
-              <w:t>3.2 Si el producto ya existe, el sistema deberá sugerir actualizar stock en lugar de crear nuevo.</w:t>
+              <w:t xml:space="preserve">Si la imagen no cumple con el formato o peso, el sistema rechaza la imagen (esto debe ser validado en el </w:t>
+            </w:r>
+            <w:proofErr w:type="spellStart"/>
+            <w:r>
+              <w:t>frontend</w:t>
+            </w:r>
+            <w:proofErr w:type="spellEnd"/>
+            <w:r>
+              <w:t>).</w:t>
             </w:r>
           </w:p>
         </w:tc>
@@ -10869,7 +11210,7 @@
         </w:tc>
         <w:tc>
           <w:tcPr>
-            <w:tcW w:w="450" w:type="dxa"/>
+            <w:tcW w:w="630" w:type="dxa"/>
             <w:shd w:val="clear" w:color="auto" w:fill="D9EAD3"/>
             <w:tcMar>
               <w:top w:w="100" w:type="dxa"/>
@@ -10897,7 +11238,7 @@
         </w:tc>
         <w:tc>
           <w:tcPr>
-            <w:tcW w:w="4200" w:type="dxa"/>
+            <w:tcW w:w="4020" w:type="dxa"/>
             <w:shd w:val="clear" w:color="auto" w:fill="D9EAD3"/>
             <w:tcMar>
               <w:top w:w="100" w:type="dxa"/>
@@ -10988,7 +11329,7 @@
         </w:tc>
         <w:tc>
           <w:tcPr>
-            <w:tcW w:w="450" w:type="dxa"/>
+            <w:tcW w:w="630" w:type="dxa"/>
             <w:tcMar>
               <w:top w:w="100" w:type="dxa"/>
               <w:left w:w="100" w:type="dxa"/>
@@ -11015,7 +11356,7 @@
         </w:tc>
         <w:tc>
           <w:tcPr>
-            <w:tcW w:w="4200" w:type="dxa"/>
+            <w:tcW w:w="4020" w:type="dxa"/>
             <w:tcMar>
               <w:top w:w="100" w:type="dxa"/>
               <w:left w:w="100" w:type="dxa"/>
@@ -11029,7 +11370,7 @@
               <w:spacing w:line="360" w:lineRule="auto"/>
             </w:pPr>
             <w:r>
-              <w:t>En el caso de que se intente eliminar un producto con historial de ventas</w:t>
+              <w:t>Si se intenta eliminar un producto con historial de ventas.</w:t>
             </w:r>
           </w:p>
         </w:tc>
@@ -11056,7 +11397,7 @@
               <w:spacing w:line="360" w:lineRule="auto"/>
             </w:pPr>
             <w:r>
-              <w:t>El sistema deberá ofrecer opción de marcar como "No disponible" en lugar de eliminar, conservar registro.</w:t>
+              <w:t>El sistema debería ofrecer marcar como "No disponible" en lugar de eliminar, pero esa lógica no está implementada. La eliminación actual es un borrado físico.</w:t>
             </w:r>
           </w:p>
         </w:tc>
@@ -11092,7 +11433,7 @@
         </w:tc>
         <w:tc>
           <w:tcPr>
-            <w:tcW w:w="450" w:type="dxa"/>
+            <w:tcW w:w="630" w:type="dxa"/>
             <w:tcMar>
               <w:top w:w="100" w:type="dxa"/>
               <w:left w:w="100" w:type="dxa"/>
@@ -11119,7 +11460,7 @@
         </w:tc>
         <w:tc>
           <w:tcPr>
-            <w:tcW w:w="4200" w:type="dxa"/>
+            <w:tcW w:w="4020" w:type="dxa"/>
             <w:tcMar>
               <w:top w:w="100" w:type="dxa"/>
               <w:left w:w="100" w:type="dxa"/>
@@ -11140,7 +11481,7 @@
               <w:spacing w:line="360" w:lineRule="auto"/>
             </w:pPr>
             <w:r>
-              <w:t>En el caso de que el precio sea $0 o negativo</w:t>
+              <w:t>Si el precio es negativo o $0.</w:t>
             </w:r>
           </w:p>
         </w:tc>
@@ -11167,7 +11508,15 @@
               <w:spacing w:line="360" w:lineRule="auto"/>
             </w:pPr>
             <w:r>
-              <w:t>El sistema deberá validar y rechazar, solicitar precio válido mayor a 0.</w:t>
+              <w:t xml:space="preserve">El sistema valida y rechaza la operación (se asume validación en el </w:t>
+            </w:r>
+            <w:proofErr w:type="spellStart"/>
+            <w:r>
+              <w:t>frontend</w:t>
+            </w:r>
+            <w:proofErr w:type="spellEnd"/>
+            <w:r>
+              <w:t>).</w:t>
             </w:r>
           </w:p>
         </w:tc>
@@ -11240,7 +11589,7 @@
                 <w:szCs w:val="23"/>
                 <w:shd w:val="clear" w:color="auto" w:fill="FFFFFF"/>
               </w:rPr>
-              <w:t>La carga de producto debe completarse en menos de 4 segundos incluyendo subida de imagen.</w:t>
+              <w:t>La carga de producto debe completarse en menos de 4 segundos.</w:t>
             </w:r>
           </w:p>
         </w:tc>
@@ -11314,7 +11663,7 @@
                 <w:szCs w:val="23"/>
                 <w:shd w:val="clear" w:color="auto" w:fill="FFFFFF"/>
               </w:rPr>
-              <w:t>Este caso de uso se espera que se lleve a cabo una media de 1 vez cada dos semanas (cuando hay nuevos productos).</w:t>
+              <w:t>Media de 1 vez cada dos semanas.</w:t>
             </w:r>
           </w:p>
         </w:tc>
@@ -11386,7 +11735,8 @@
             </w:pPr>
             <w:r>
               <w:rPr>
-                <w:rStyle w:val="Fuerte"/>
+                <w:b/>
+                <w:bCs/>
                 <w:color w:val="0F1115"/>
                 <w:sz w:val="23"/>
                 <w:szCs w:val="23"/>
@@ -11464,7 +11814,8 @@
             </w:pPr>
             <w:r>
               <w:rPr>
-                <w:rStyle w:val="Fuerte"/>
+                <w:b/>
+                <w:bCs/>
                 <w:color w:val="0F1115"/>
                 <w:sz w:val="23"/>
                 <w:szCs w:val="23"/>
@@ -11543,7 +11894,27 @@
                 <w:szCs w:val="23"/>
                 <w:shd w:val="clear" w:color="auto" w:fill="FFFFFF"/>
               </w:rPr>
-              <w:t>Los productos no se compran en línea, solo se visualizan. El sistema es un escaparate que deriva a WhatsApp.</w:t>
+              <w:t>Los productos no se compran en línea, solo se visualizan. El sistema es un escaparate que deriva a WhatsApp. El modelo </w:t>
+            </w:r>
+            <w:proofErr w:type="spellStart"/>
+            <w:r>
+              <w:rPr>
+                <w:color w:val="0F1115"/>
+                <w:sz w:val="23"/>
+                <w:szCs w:val="23"/>
+                <w:shd w:val="clear" w:color="auto" w:fill="FFFFFF"/>
+              </w:rPr>
+              <w:t>Product</w:t>
+            </w:r>
+            <w:proofErr w:type="spellEnd"/>
+            <w:r>
+              <w:rPr>
+                <w:color w:val="0F1115"/>
+                <w:sz w:val="23"/>
+                <w:szCs w:val="23"/>
+                <w:shd w:val="clear" w:color="auto" w:fill="FFFFFF"/>
+              </w:rPr>
+              <w:t> y las rutas están completas.</w:t>
             </w:r>
           </w:p>
         </w:tc>
@@ -11551,7 +11922,7 @@
     </w:tbl>
     <w:tbl>
       <w:tblPr>
-        <w:tblpPr w:leftFromText="141" w:rightFromText="141" w:vertAnchor="page" w:horzAnchor="page" w:tblpX="1" w:tblpY="3689"/>
+        <w:tblpPr w:leftFromText="141" w:rightFromText="141" w:vertAnchor="page" w:horzAnchor="margin" w:tblpY="3689"/>
         <w:tblOverlap w:val="never"/>
         <w:tblW w:w="11100" w:type="dxa"/>
         <w:tblBorders>
@@ -11639,8 +12010,25 @@
             <w:r>
               <w:rPr>
                 <w:b/>
-              </w:rPr>
-              <w:t>Inicio de Sesión de Estudiante</w:t>
+                <w:bCs/>
+              </w:rPr>
+              <w:t xml:space="preserve">Inicio de Sesión de Estudiante (Rol </w:t>
+            </w:r>
+            <w:proofErr w:type="spellStart"/>
+            <w:r>
+              <w:rPr>
+                <w:b/>
+                <w:bCs/>
+              </w:rPr>
+              <w:t>User</w:t>
+            </w:r>
+            <w:proofErr w:type="spellEnd"/>
+            <w:r>
+              <w:rPr>
+                <w:b/>
+                <w:bCs/>
+              </w:rPr>
+              <w:t>)</w:t>
             </w:r>
           </w:p>
         </w:tc>
@@ -11713,7 +12101,27 @@
                 <w:szCs w:val="23"/>
                 <w:shd w:val="clear" w:color="auto" w:fill="FFFFFF"/>
               </w:rPr>
-              <w:t>El estudiante inicia sesión con su documento y contraseña para acceder a su perfil personalizado y ver su información específica (horarios, torneos, etc.).</w:t>
+              <w:t>El estudiante inicia sesión con su email y contraseña para acceder a su perfil personalizado. </w:t>
+            </w:r>
+            <w:r>
+              <w:rPr>
+                <w:b/>
+                <w:bCs/>
+                <w:color w:val="0F1115"/>
+                <w:sz w:val="23"/>
+                <w:szCs w:val="23"/>
+                <w:shd w:val="clear" w:color="auto" w:fill="FFFFFF"/>
+              </w:rPr>
+              <w:t>Este caso de uso es idéntico al CU01</w:t>
+            </w:r>
+            <w:r>
+              <w:rPr>
+                <w:color w:val="0F1115"/>
+                <w:sz w:val="23"/>
+                <w:szCs w:val="23"/>
+                <w:shd w:val="clear" w:color="auto" w:fill="FFFFFF"/>
+              </w:rPr>
+              <w:t>, ya que la autenticación es la misma para todos los roles. La diferencia es la vista a la que se redirige.</w:t>
             </w:r>
           </w:p>
         </w:tc>
@@ -11786,7 +12194,27 @@
                 <w:szCs w:val="23"/>
                 <w:shd w:val="clear" w:color="auto" w:fill="FFFFFF"/>
               </w:rPr>
-              <w:t>Estudiante</w:t>
+              <w:t>Estudiante (</w:t>
+            </w:r>
+            <w:proofErr w:type="spellStart"/>
+            <w:r>
+              <w:rPr>
+                <w:color w:val="0F1115"/>
+                <w:sz w:val="23"/>
+                <w:szCs w:val="23"/>
+                <w:shd w:val="clear" w:color="auto" w:fill="FFFFFF"/>
+              </w:rPr>
+              <w:t>user</w:t>
+            </w:r>
+            <w:proofErr w:type="spellEnd"/>
+            <w:r>
+              <w:rPr>
+                <w:color w:val="0F1115"/>
+                <w:sz w:val="23"/>
+                <w:szCs w:val="23"/>
+                <w:shd w:val="clear" w:color="auto" w:fill="FFFFFF"/>
+              </w:rPr>
+              <w:t>)</w:t>
             </w:r>
           </w:p>
         </w:tc>
@@ -11881,24 +12309,77 @@
                 <w:szCs w:val="23"/>
                 <w:shd w:val="clear" w:color="auto" w:fill="FFFFFF"/>
               </w:rPr>
-              <w:t>1. El estudiante debe estar registrado previamente.</w:t>
-            </w:r>
-            <w:r>
-              <w:rPr>
-                <w:color w:val="0F1115"/>
-                <w:sz w:val="23"/>
-                <w:szCs w:val="23"/>
+              <w:t>1. El estudiante debe estar registrado previamente en la tabla </w:t>
+            </w:r>
+            <w:proofErr w:type="spellStart"/>
+            <w:r>
+              <w:rPr>
+                <w:color w:val="0F1115"/>
+                <w:sz w:val="23"/>
+                <w:szCs w:val="23"/>
+                <w:shd w:val="clear" w:color="auto" w:fill="FFFFFF"/>
+              </w:rPr>
+              <w:t>users</w:t>
+            </w:r>
+            <w:proofErr w:type="spellEnd"/>
+            <w:r>
+              <w:rPr>
+                <w:color w:val="0F1115"/>
+                <w:sz w:val="23"/>
+                <w:szCs w:val="23"/>
+                <w:shd w:val="clear" w:color="auto" w:fill="FFFFFF"/>
+              </w:rPr>
+              <w:t> con rol </w:t>
+            </w:r>
+            <w:proofErr w:type="spellStart"/>
+            <w:r>
+              <w:rPr>
+                <w:color w:val="0F1115"/>
+                <w:sz w:val="23"/>
+                <w:szCs w:val="23"/>
+                <w:shd w:val="clear" w:color="auto" w:fill="FFFFFF"/>
+              </w:rPr>
+              <w:t>user</w:t>
+            </w:r>
+            <w:proofErr w:type="spellEnd"/>
+            <w:r>
+              <w:rPr>
+                <w:color w:val="0F1115"/>
+                <w:sz w:val="23"/>
+                <w:szCs w:val="23"/>
+                <w:shd w:val="clear" w:color="auto" w:fill="FFFFFF"/>
+              </w:rPr>
+              <w:t> y estar vinculado a un </w:t>
+            </w:r>
+            <w:proofErr w:type="spellStart"/>
+            <w:r>
+              <w:rPr>
+                <w:color w:val="0F1115"/>
+                <w:sz w:val="23"/>
+                <w:szCs w:val="23"/>
+                <w:shd w:val="clear" w:color="auto" w:fill="FFFFFF"/>
+              </w:rPr>
+              <w:t>student</w:t>
+            </w:r>
+            <w:proofErr w:type="spellEnd"/>
+            <w:r>
+              <w:rPr>
+                <w:color w:val="0F1115"/>
+                <w:sz w:val="23"/>
+                <w:szCs w:val="23"/>
+                <w:shd w:val="clear" w:color="auto" w:fill="FFFFFF"/>
+              </w:rPr>
+              <w:t>.</w:t>
+            </w:r>
+            <w:r>
+              <w:rPr>
+                <w:color w:val="0F1115"/>
+                <w:sz w:val="23"/>
+                <w:szCs w:val="23"/>
+                <w:shd w:val="clear" w:color="auto" w:fill="FFFFFF"/>
               </w:rPr>
               <w:br/>
-            </w:r>
-            <w:r>
-              <w:rPr>
-                <w:color w:val="0F1115"/>
-                <w:sz w:val="23"/>
-                <w:szCs w:val="23"/>
-                <w:shd w:val="clear" w:color="auto" w:fill="FFFFFF"/>
-              </w:rPr>
-              <w:t>2. Debe recordar sus credenciales (documento y contraseña).</w:t>
+              <w:t>2. Debe recordar sus credenciales.</w:t>
             </w:r>
           </w:p>
         </w:tc>
@@ -11964,24 +12445,67 @@
                 <w:szCs w:val="23"/>
                 <w:shd w:val="clear" w:color="auto" w:fill="FFFFFF"/>
               </w:rPr>
-              <w:t>1. El estudiante accede al menú principal, visualiza catalogo con botones de navegación en la parte superior para acceder a su información y la de su torneo.</w:t>
-            </w:r>
-            <w:r>
-              <w:rPr>
-                <w:color w:val="0F1115"/>
-                <w:sz w:val="23"/>
-                <w:szCs w:val="23"/>
-              </w:rPr>
-              <w:br/>
-            </w:r>
-            <w:r>
-              <w:rPr>
-                <w:color w:val="0F1115"/>
-                <w:sz w:val="23"/>
-                <w:szCs w:val="23"/>
-                <w:shd w:val="clear" w:color="auto" w:fill="FFFFFF"/>
-              </w:rPr>
-              <w:t>2. Se inicia una sesión segura con tiempo limitado.</w:t>
+              <w:t xml:space="preserve">1. El estudiante accede al sistema y se le muestra el catálogo o el </w:t>
+            </w:r>
+            <w:proofErr w:type="spellStart"/>
+            <w:r>
+              <w:rPr>
+                <w:color w:val="0F1115"/>
+                <w:sz w:val="23"/>
+                <w:szCs w:val="23"/>
+                <w:shd w:val="clear" w:color="auto" w:fill="FFFFFF"/>
+              </w:rPr>
+              <w:t>dashboard</w:t>
+            </w:r>
+            <w:proofErr w:type="spellEnd"/>
+            <w:r>
+              <w:rPr>
+                <w:color w:val="0F1115"/>
+                <w:sz w:val="23"/>
+                <w:szCs w:val="23"/>
+                <w:shd w:val="clear" w:color="auto" w:fill="FFFFFF"/>
+              </w:rPr>
+              <w:t xml:space="preserve"> (según la lógica del </w:t>
+            </w:r>
+            <w:proofErr w:type="spellStart"/>
+            <w:r>
+              <w:rPr>
+                <w:color w:val="0F1115"/>
+                <w:sz w:val="23"/>
+                <w:szCs w:val="23"/>
+                <w:shd w:val="clear" w:color="auto" w:fill="FFFFFF"/>
+              </w:rPr>
+              <w:t>frontend</w:t>
+            </w:r>
+            <w:proofErr w:type="spellEnd"/>
+            <w:r>
+              <w:rPr>
+                <w:color w:val="0F1115"/>
+                <w:sz w:val="23"/>
+                <w:szCs w:val="23"/>
+                <w:shd w:val="clear" w:color="auto" w:fill="FFFFFF"/>
+              </w:rPr>
+              <w:t>). Actualmente, todos los roles redirigen a /</w:t>
+            </w:r>
+            <w:proofErr w:type="spellStart"/>
+            <w:r>
+              <w:rPr>
+                <w:color w:val="0F1115"/>
+                <w:sz w:val="23"/>
+                <w:szCs w:val="23"/>
+                <w:shd w:val="clear" w:color="auto" w:fill="FFFFFF"/>
+              </w:rPr>
+              <w:t>dashboard</w:t>
+            </w:r>
+            <w:proofErr w:type="spellEnd"/>
+            <w:r>
+              <w:rPr>
+                <w:color w:val="0F1115"/>
+                <w:sz w:val="23"/>
+                <w:szCs w:val="23"/>
+                <w:shd w:val="clear" w:color="auto" w:fill="FFFFFF"/>
+              </w:rPr>
+              <w:t>.</w:t>
             </w:r>
           </w:p>
         </w:tc>
@@ -12200,7 +12724,27 @@
                 <w:szCs w:val="23"/>
                 <w:shd w:val="clear" w:color="auto" w:fill="FFFFFF"/>
               </w:rPr>
-              <w:t>El estudiante accede a la página de inicio de sesión.</w:t>
+              <w:t>El estudiante navega a /</w:t>
+            </w:r>
+            <w:proofErr w:type="spellStart"/>
+            <w:r>
+              <w:rPr>
+                <w:color w:val="0F1115"/>
+                <w:sz w:val="23"/>
+                <w:szCs w:val="23"/>
+                <w:shd w:val="clear" w:color="auto" w:fill="FFFFFF"/>
+              </w:rPr>
+              <w:t>login</w:t>
+            </w:r>
+            <w:proofErr w:type="spellEnd"/>
+            <w:r>
+              <w:rPr>
+                <w:color w:val="0F1115"/>
+                <w:sz w:val="23"/>
+                <w:szCs w:val="23"/>
+                <w:shd w:val="clear" w:color="auto" w:fill="FFFFFF"/>
+              </w:rPr>
+              <w:t>.</w:t>
             </w:r>
           </w:p>
         </w:tc>
@@ -12233,7 +12777,27 @@
                 <w:szCs w:val="23"/>
                 <w:shd w:val="clear" w:color="auto" w:fill="FFFFFF"/>
               </w:rPr>
-              <w:t>El sistema muestra campos: documento, contraseña, y botón "Iniciar Sesión".</w:t>
+              <w:t xml:space="preserve">El sistema muestra los campos de </w:t>
+            </w:r>
+            <w:proofErr w:type="spellStart"/>
+            <w:r>
+              <w:rPr>
+                <w:color w:val="0F1115"/>
+                <w:sz w:val="23"/>
+                <w:szCs w:val="23"/>
+                <w:shd w:val="clear" w:color="auto" w:fill="FFFFFF"/>
+              </w:rPr>
+              <w:t>login</w:t>
+            </w:r>
+            <w:proofErr w:type="spellEnd"/>
+            <w:r>
+              <w:rPr>
+                <w:color w:val="0F1115"/>
+                <w:sz w:val="23"/>
+                <w:szCs w:val="23"/>
+                <w:shd w:val="clear" w:color="auto" w:fill="FFFFFF"/>
+              </w:rPr>
+              <w:t>.</w:t>
             </w:r>
           </w:p>
         </w:tc>
@@ -12324,7 +12888,7 @@
                 <w:szCs w:val="23"/>
                 <w:shd w:val="clear" w:color="auto" w:fill="FFFFFF"/>
               </w:rPr>
-              <w:t>El estudiante ingresa su documento y contraseña, luego hace clic en "Iniciar Sesión".</w:t>
+              <w:t>El estudiante ingresa su email y contraseña.</w:t>
             </w:r>
           </w:p>
         </w:tc>
@@ -12357,7 +12921,248 @@
                 <w:szCs w:val="23"/>
                 <w:shd w:val="clear" w:color="auto" w:fill="FFFFFF"/>
               </w:rPr>
-              <w:t>El sistema valida las credenciales contra la base de datos.</w:t>
+              <w:t>El sistema realiza la autenticación como en el CU01.</w:t>
+            </w:r>
+          </w:p>
+        </w:tc>
+      </w:tr>
+      <w:tr>
+        <w:tc>
+          <w:tcPr>
+            <w:tcW w:w="1770" w:type="dxa"/>
+            <w:shd w:val="clear" w:color="auto" w:fill="FFF2CC"/>
+            <w:tcMar>
+              <w:top w:w="100" w:type="dxa"/>
+              <w:left w:w="100" w:type="dxa"/>
+              <w:bottom w:w="100" w:type="dxa"/>
+              <w:right w:w="100" w:type="dxa"/>
+            </w:tcMar>
+          </w:tcPr>
+          <w:p>
+            <w:pPr>
+              <w:widowControl w:val="0"/>
+              <w:pBdr>
+                <w:top w:val="nil"/>
+                <w:left w:val="nil"/>
+                <w:bottom w:val="nil"/>
+                <w:right w:val="nil"/>
+                <w:between w:val="nil"/>
+              </w:pBdr>
+              <w:spacing w:line="240" w:lineRule="auto"/>
+              <w:rPr>
+                <w:b/>
+              </w:rPr>
+            </w:pPr>
+            <w:r>
+              <w:rPr>
+                <w:b/>
+              </w:rPr>
+              <w:t>Excepciones</w:t>
+            </w:r>
+          </w:p>
+        </w:tc>
+        <w:tc>
+          <w:tcPr>
+            <w:tcW w:w="450" w:type="dxa"/>
+            <w:shd w:val="clear" w:color="auto" w:fill="D9EAD3"/>
+            <w:tcMar>
+              <w:top w:w="100" w:type="dxa"/>
+              <w:left w:w="100" w:type="dxa"/>
+              <w:bottom w:w="100" w:type="dxa"/>
+              <w:right w:w="100" w:type="dxa"/>
+            </w:tcMar>
+          </w:tcPr>
+          <w:p>
+            <w:pPr>
+              <w:widowControl w:val="0"/>
+              <w:pBdr>
+                <w:top w:val="nil"/>
+                <w:left w:val="nil"/>
+                <w:bottom w:val="nil"/>
+                <w:right w:val="nil"/>
+                <w:between w:val="nil"/>
+              </w:pBdr>
+              <w:spacing w:line="240" w:lineRule="auto"/>
+            </w:pPr>
+            <w:r>
+              <w:t>#</w:t>
+            </w:r>
+          </w:p>
+        </w:tc>
+        <w:tc>
+          <w:tcPr>
+            <w:tcW w:w="4200" w:type="dxa"/>
+            <w:shd w:val="clear" w:color="auto" w:fill="D9EAD3"/>
+            <w:tcMar>
+              <w:top w:w="100" w:type="dxa"/>
+              <w:left w:w="100" w:type="dxa"/>
+              <w:bottom w:w="100" w:type="dxa"/>
+              <w:right w:w="100" w:type="dxa"/>
+            </w:tcMar>
+          </w:tcPr>
+          <w:p>
+            <w:pPr>
+              <w:widowControl w:val="0"/>
+              <w:spacing w:line="240" w:lineRule="auto"/>
+              <w:rPr>
+                <w:b/>
+              </w:rPr>
+            </w:pPr>
+            <w:r>
+              <w:rPr>
+                <w:b/>
+              </w:rPr>
+              <w:t>Acción (actor)</w:t>
+            </w:r>
+          </w:p>
+        </w:tc>
+        <w:tc>
+          <w:tcPr>
+            <w:tcW w:w="4680" w:type="dxa"/>
+            <w:shd w:val="clear" w:color="auto" w:fill="D9EAD3"/>
+            <w:tcMar>
+              <w:top w:w="100" w:type="dxa"/>
+              <w:left w:w="100" w:type="dxa"/>
+              <w:bottom w:w="100" w:type="dxa"/>
+              <w:right w:w="100" w:type="dxa"/>
+            </w:tcMar>
+          </w:tcPr>
+          <w:p>
+            <w:pPr>
+              <w:widowControl w:val="0"/>
+              <w:pBdr>
+                <w:top w:val="nil"/>
+                <w:left w:val="nil"/>
+                <w:bottom w:val="nil"/>
+                <w:right w:val="nil"/>
+                <w:between w:val="nil"/>
+              </w:pBdr>
+              <w:spacing w:line="240" w:lineRule="auto"/>
+              <w:rPr>
+                <w:b/>
+              </w:rPr>
+            </w:pPr>
+            <w:r>
+              <w:rPr>
+                <w:b/>
+              </w:rPr>
+              <w:t>Reacción (sistema)</w:t>
+            </w:r>
+          </w:p>
+        </w:tc>
+      </w:tr>
+      <w:tr>
+        <w:tc>
+          <w:tcPr>
+            <w:tcW w:w="1770" w:type="dxa"/>
+            <w:shd w:val="clear" w:color="auto" w:fill="FFF2CC"/>
+            <w:tcMar>
+              <w:top w:w="100" w:type="dxa"/>
+              <w:left w:w="100" w:type="dxa"/>
+              <w:bottom w:w="100" w:type="dxa"/>
+              <w:right w:w="100" w:type="dxa"/>
+            </w:tcMar>
+          </w:tcPr>
+          <w:p>
+            <w:pPr>
+              <w:widowControl w:val="0"/>
+              <w:pBdr>
+                <w:top w:val="nil"/>
+                <w:left w:val="nil"/>
+                <w:bottom w:val="nil"/>
+                <w:right w:val="nil"/>
+                <w:between w:val="nil"/>
+              </w:pBdr>
+              <w:spacing w:line="240" w:lineRule="auto"/>
+              <w:rPr>
+                <w:b/>
+              </w:rPr>
+            </w:pPr>
+          </w:p>
+        </w:tc>
+        <w:tc>
+          <w:tcPr>
+            <w:tcW w:w="450" w:type="dxa"/>
+            <w:tcMar>
+              <w:top w:w="100" w:type="dxa"/>
+              <w:left w:w="100" w:type="dxa"/>
+              <w:bottom w:w="100" w:type="dxa"/>
+              <w:right w:w="100" w:type="dxa"/>
+            </w:tcMar>
+          </w:tcPr>
+          <w:p>
+            <w:pPr>
+              <w:widowControl w:val="0"/>
+              <w:pBdr>
+                <w:top w:val="nil"/>
+                <w:left w:val="nil"/>
+                <w:bottom w:val="nil"/>
+                <w:right w:val="nil"/>
+                <w:between w:val="nil"/>
+              </w:pBdr>
+              <w:spacing w:line="240" w:lineRule="auto"/>
+            </w:pPr>
+            <w:r>
+              <w:t>p</w:t>
+            </w:r>
+          </w:p>
+        </w:tc>
+        <w:tc>
+          <w:tcPr>
+            <w:tcW w:w="4200" w:type="dxa"/>
+            <w:tcMar>
+              <w:top w:w="100" w:type="dxa"/>
+              <w:left w:w="100" w:type="dxa"/>
+              <w:bottom w:w="100" w:type="dxa"/>
+              <w:right w:w="100" w:type="dxa"/>
+            </w:tcMar>
+          </w:tcPr>
+          <w:p>
+            <w:pPr>
+              <w:widowControl w:val="0"/>
+              <w:spacing w:line="240" w:lineRule="auto"/>
+            </w:pPr>
+            <w:r>
+              <w:rPr>
+                <w:color w:val="0F1115"/>
+                <w:sz w:val="23"/>
+                <w:szCs w:val="23"/>
+                <w:shd w:val="clear" w:color="auto" w:fill="FFFFFF"/>
+              </w:rPr>
+              <w:t>En el caso de que las credenciales sean incorrectas</w:t>
+            </w:r>
+          </w:p>
+        </w:tc>
+        <w:tc>
+          <w:tcPr>
+            <w:tcW w:w="4680" w:type="dxa"/>
+            <w:tcMar>
+              <w:top w:w="100" w:type="dxa"/>
+              <w:left w:w="100" w:type="dxa"/>
+              <w:bottom w:w="100" w:type="dxa"/>
+              <w:right w:w="100" w:type="dxa"/>
+            </w:tcMar>
+          </w:tcPr>
+          <w:p>
+            <w:pPr>
+              <w:widowControl w:val="0"/>
+              <w:pBdr>
+                <w:top w:val="nil"/>
+                <w:left w:val="nil"/>
+                <w:bottom w:val="nil"/>
+                <w:right w:val="nil"/>
+                <w:between w:val="nil"/>
+              </w:pBdr>
+              <w:spacing w:line="240" w:lineRule="auto"/>
+            </w:pPr>
+            <w:r>
+              <w:rPr>
+                <w:color w:val="0F1115"/>
+                <w:sz w:val="23"/>
+                <w:szCs w:val="23"/>
+                <w:shd w:val="clear" w:color="auto" w:fill="FFFFFF"/>
+              </w:rPr>
+              <w:t>El sistema deberá mostrar mensaje genérico: "Documento o contraseña incorrectos", no especificar cuál falló.</w:t>
             </w:r>
           </w:p>
         </w:tc>
@@ -12369,7 +13174,6 @@
         <w:tc>
           <w:tcPr>
             <w:tcW w:w="1770" w:type="dxa"/>
-            <w:vMerge/>
             <w:shd w:val="clear" w:color="auto" w:fill="FFF2CC"/>
             <w:tcMar>
               <w:top w:w="100" w:type="dxa"/>
@@ -12389,329 +13193,49 @@
                 <w:between w:val="nil"/>
               </w:pBdr>
               <w:spacing w:line="240" w:lineRule="auto"/>
-            </w:pPr>
-          </w:p>
-        </w:tc>
-        <w:tc>
-          <w:tcPr>
-            <w:tcW w:w="450" w:type="dxa"/>
-            <w:tcMar>
-              <w:top w:w="100" w:type="dxa"/>
-              <w:left w:w="100" w:type="dxa"/>
-              <w:bottom w:w="100" w:type="dxa"/>
-              <w:right w:w="100" w:type="dxa"/>
-            </w:tcMar>
-          </w:tcPr>
-          <w:p>
-            <w:pPr>
-              <w:widowControl w:val="0"/>
-              <w:pBdr>
-                <w:top w:val="nil"/>
-                <w:left w:val="nil"/>
-                <w:bottom w:val="nil"/>
-                <w:right w:val="nil"/>
-                <w:between w:val="nil"/>
-              </w:pBdr>
-              <w:spacing w:line="240" w:lineRule="auto"/>
-            </w:pPr>
-          </w:p>
-        </w:tc>
-        <w:tc>
-          <w:tcPr>
-            <w:tcW w:w="4200" w:type="dxa"/>
-            <w:tcMar>
-              <w:top w:w="100" w:type="dxa"/>
-              <w:left w:w="100" w:type="dxa"/>
-              <w:bottom w:w="100" w:type="dxa"/>
-              <w:right w:w="100" w:type="dxa"/>
-            </w:tcMar>
-          </w:tcPr>
-          <w:p>
-            <w:pPr>
-              <w:widowControl w:val="0"/>
-              <w:numPr>
-                <w:ilvl w:val="0"/>
-                <w:numId w:val="1"/>
-              </w:numPr>
-              <w:spacing w:line="240" w:lineRule="auto"/>
-            </w:pPr>
-            <w:r>
-              <w:t xml:space="preserve">2.1 </w:t>
-            </w:r>
-            <w:r>
-              <w:rPr>
-                <w:color w:val="0F1115"/>
-                <w:sz w:val="23"/>
-                <w:szCs w:val="23"/>
-                <w:shd w:val="clear" w:color="auto" w:fill="FFFFFF"/>
-              </w:rPr>
-              <w:t>Silas credenciales son correctas, redirige al catálogo.</w:t>
-            </w:r>
-          </w:p>
-        </w:tc>
-        <w:tc>
-          <w:tcPr>
-            <w:tcW w:w="4680" w:type="dxa"/>
-            <w:tcMar>
-              <w:top w:w="100" w:type="dxa"/>
-              <w:left w:w="100" w:type="dxa"/>
-              <w:bottom w:w="100" w:type="dxa"/>
-              <w:right w:w="100" w:type="dxa"/>
-            </w:tcMar>
-          </w:tcPr>
-          <w:p>
-            <w:pPr>
-              <w:widowControl w:val="0"/>
-              <w:pBdr>
-                <w:top w:val="nil"/>
-                <w:left w:val="nil"/>
-                <w:bottom w:val="nil"/>
-                <w:right w:val="nil"/>
-                <w:between w:val="nil"/>
-              </w:pBdr>
-              <w:spacing w:line="240" w:lineRule="auto"/>
-              <w:ind w:left="720"/>
-            </w:pPr>
-          </w:p>
-        </w:tc>
-      </w:tr>
-      <w:tr>
-        <w:tc>
-          <w:tcPr>
-            <w:tcW w:w="1770" w:type="dxa"/>
-            <w:shd w:val="clear" w:color="auto" w:fill="FFF2CC"/>
-            <w:tcMar>
-              <w:top w:w="100" w:type="dxa"/>
-              <w:left w:w="100" w:type="dxa"/>
-              <w:bottom w:w="100" w:type="dxa"/>
-              <w:right w:w="100" w:type="dxa"/>
-            </w:tcMar>
-          </w:tcPr>
-          <w:p>
-            <w:pPr>
-              <w:widowControl w:val="0"/>
-              <w:pBdr>
-                <w:top w:val="nil"/>
-                <w:left w:val="nil"/>
-                <w:bottom w:val="nil"/>
-                <w:right w:val="nil"/>
-                <w:between w:val="nil"/>
-              </w:pBdr>
-              <w:spacing w:line="240" w:lineRule="auto"/>
-              <w:rPr>
-                <w:b/>
-              </w:rPr>
-            </w:pPr>
-            <w:r>
-              <w:rPr>
-                <w:b/>
-              </w:rPr>
-              <w:t>Excepciones</w:t>
-            </w:r>
-          </w:p>
-        </w:tc>
-        <w:tc>
-          <w:tcPr>
-            <w:tcW w:w="450" w:type="dxa"/>
-            <w:shd w:val="clear" w:color="auto" w:fill="D9EAD3"/>
-            <w:tcMar>
-              <w:top w:w="100" w:type="dxa"/>
-              <w:left w:w="100" w:type="dxa"/>
-              <w:bottom w:w="100" w:type="dxa"/>
-              <w:right w:w="100" w:type="dxa"/>
-            </w:tcMar>
-          </w:tcPr>
-          <w:p>
-            <w:pPr>
-              <w:widowControl w:val="0"/>
-              <w:pBdr>
-                <w:top w:val="nil"/>
-                <w:left w:val="nil"/>
-                <w:bottom w:val="nil"/>
-                <w:right w:val="nil"/>
-                <w:between w:val="nil"/>
-              </w:pBdr>
-              <w:spacing w:line="240" w:lineRule="auto"/>
-            </w:pPr>
-            <w:r>
-              <w:t>#</w:t>
-            </w:r>
-          </w:p>
-        </w:tc>
-        <w:tc>
-          <w:tcPr>
-            <w:tcW w:w="4200" w:type="dxa"/>
-            <w:shd w:val="clear" w:color="auto" w:fill="D9EAD3"/>
-            <w:tcMar>
-              <w:top w:w="100" w:type="dxa"/>
-              <w:left w:w="100" w:type="dxa"/>
-              <w:bottom w:w="100" w:type="dxa"/>
-              <w:right w:w="100" w:type="dxa"/>
-            </w:tcMar>
-          </w:tcPr>
-          <w:p>
-            <w:pPr>
-              <w:widowControl w:val="0"/>
-              <w:spacing w:line="240" w:lineRule="auto"/>
-              <w:rPr>
-                <w:b/>
-              </w:rPr>
-            </w:pPr>
-            <w:r>
-              <w:rPr>
-                <w:b/>
-              </w:rPr>
-              <w:t>Acción (actor)</w:t>
-            </w:r>
-          </w:p>
-        </w:tc>
-        <w:tc>
-          <w:tcPr>
-            <w:tcW w:w="4680" w:type="dxa"/>
-            <w:shd w:val="clear" w:color="auto" w:fill="D9EAD3"/>
-            <w:tcMar>
-              <w:top w:w="100" w:type="dxa"/>
-              <w:left w:w="100" w:type="dxa"/>
-              <w:bottom w:w="100" w:type="dxa"/>
-              <w:right w:w="100" w:type="dxa"/>
-            </w:tcMar>
-          </w:tcPr>
-          <w:p>
-            <w:pPr>
-              <w:widowControl w:val="0"/>
-              <w:pBdr>
-                <w:top w:val="nil"/>
-                <w:left w:val="nil"/>
-                <w:bottom w:val="nil"/>
-                <w:right w:val="nil"/>
-                <w:between w:val="nil"/>
-              </w:pBdr>
-              <w:spacing w:line="240" w:lineRule="auto"/>
-              <w:rPr>
-                <w:b/>
-              </w:rPr>
-            </w:pPr>
-            <w:r>
-              <w:rPr>
-                <w:b/>
-              </w:rPr>
-              <w:t>Reacción (sistema)</w:t>
-            </w:r>
-          </w:p>
-        </w:tc>
-      </w:tr>
-      <w:tr>
-        <w:tc>
-          <w:tcPr>
-            <w:tcW w:w="1770" w:type="dxa"/>
-            <w:shd w:val="clear" w:color="auto" w:fill="FFF2CC"/>
-            <w:tcMar>
-              <w:top w:w="100" w:type="dxa"/>
-              <w:left w:w="100" w:type="dxa"/>
-              <w:bottom w:w="100" w:type="dxa"/>
-              <w:right w:w="100" w:type="dxa"/>
-            </w:tcMar>
-          </w:tcPr>
-          <w:p>
-            <w:pPr>
-              <w:widowControl w:val="0"/>
-              <w:pBdr>
-                <w:top w:val="nil"/>
-                <w:left w:val="nil"/>
-                <w:bottom w:val="nil"/>
-                <w:right w:val="nil"/>
-                <w:between w:val="nil"/>
-              </w:pBdr>
-              <w:spacing w:line="240" w:lineRule="auto"/>
-              <w:rPr>
-                <w:b/>
-              </w:rPr>
-            </w:pPr>
-          </w:p>
-        </w:tc>
-        <w:tc>
-          <w:tcPr>
-            <w:tcW w:w="450" w:type="dxa"/>
-            <w:tcMar>
-              <w:top w:w="100" w:type="dxa"/>
-              <w:left w:w="100" w:type="dxa"/>
-              <w:bottom w:w="100" w:type="dxa"/>
-              <w:right w:w="100" w:type="dxa"/>
-            </w:tcMar>
-          </w:tcPr>
-          <w:p>
-            <w:pPr>
-              <w:widowControl w:val="0"/>
-              <w:pBdr>
-                <w:top w:val="nil"/>
-                <w:left w:val="nil"/>
-                <w:bottom w:val="nil"/>
-                <w:right w:val="nil"/>
-                <w:between w:val="nil"/>
-              </w:pBdr>
-              <w:spacing w:line="240" w:lineRule="auto"/>
-            </w:pPr>
-            <w:r>
-              <w:t>p</w:t>
-            </w:r>
-          </w:p>
-        </w:tc>
-        <w:tc>
-          <w:tcPr>
-            <w:tcW w:w="4200" w:type="dxa"/>
-            <w:tcMar>
-              <w:top w:w="100" w:type="dxa"/>
-              <w:left w:w="100" w:type="dxa"/>
-              <w:bottom w:w="100" w:type="dxa"/>
-              <w:right w:w="100" w:type="dxa"/>
-            </w:tcMar>
-          </w:tcPr>
-          <w:p>
-            <w:pPr>
-              <w:widowControl w:val="0"/>
-              <w:spacing w:line="240" w:lineRule="auto"/>
-            </w:pPr>
-            <w:r>
-              <w:rPr>
-                <w:color w:val="0F1115"/>
-                <w:sz w:val="23"/>
-                <w:szCs w:val="23"/>
-                <w:shd w:val="clear" w:color="auto" w:fill="FFFFFF"/>
-              </w:rPr>
-              <w:t>En el caso de que las credenciales sean incorrectas</w:t>
-            </w:r>
-          </w:p>
-        </w:tc>
-        <w:tc>
-          <w:tcPr>
-            <w:tcW w:w="4680" w:type="dxa"/>
-            <w:tcMar>
-              <w:top w:w="100" w:type="dxa"/>
-              <w:left w:w="100" w:type="dxa"/>
-              <w:bottom w:w="100" w:type="dxa"/>
-              <w:right w:w="100" w:type="dxa"/>
-            </w:tcMar>
-          </w:tcPr>
-          <w:p>
-            <w:pPr>
-              <w:widowControl w:val="0"/>
-              <w:pBdr>
-                <w:top w:val="nil"/>
-                <w:left w:val="nil"/>
-                <w:bottom w:val="nil"/>
-                <w:right w:val="nil"/>
-                <w:between w:val="nil"/>
-              </w:pBdr>
-              <w:spacing w:line="240" w:lineRule="auto"/>
-            </w:pPr>
-            <w:r>
-              <w:rPr>
-                <w:color w:val="0F1115"/>
-                <w:sz w:val="23"/>
-                <w:szCs w:val="23"/>
-                <w:shd w:val="clear" w:color="auto" w:fill="FFFFFF"/>
-              </w:rPr>
-              <w:t>El sistema deberá mostrar mensaje genérico: "Documento o contraseña incorrectos", no especificar cuál falló.</w:t>
+              <w:rPr>
+                <w:b/>
+              </w:rPr>
+            </w:pPr>
+            <w:r>
+              <w:rPr>
+                <w:b/>
+              </w:rPr>
+              <w:t>Rendimiento</w:t>
+            </w:r>
+          </w:p>
+        </w:tc>
+        <w:tc>
+          <w:tcPr>
+            <w:tcW w:w="9330" w:type="dxa"/>
+            <w:gridSpan w:val="3"/>
+            <w:tcMar>
+              <w:top w:w="100" w:type="dxa"/>
+              <w:left w:w="100" w:type="dxa"/>
+              <w:bottom w:w="100" w:type="dxa"/>
+              <w:right w:w="100" w:type="dxa"/>
+            </w:tcMar>
+          </w:tcPr>
+          <w:p>
+            <w:pPr>
+              <w:widowControl w:val="0"/>
+              <w:pBdr>
+                <w:top w:val="nil"/>
+                <w:left w:val="nil"/>
+                <w:bottom w:val="nil"/>
+                <w:right w:val="nil"/>
+                <w:between w:val="nil"/>
+              </w:pBdr>
+              <w:spacing w:line="240" w:lineRule="auto"/>
+            </w:pPr>
+            <w:r>
+              <w:rPr>
+                <w:color w:val="0F1115"/>
+                <w:sz w:val="23"/>
+                <w:szCs w:val="23"/>
+                <w:shd w:val="clear" w:color="auto" w:fill="FFFFFF"/>
+              </w:rPr>
+              <w:t>La autenticación debe completarse en menos de 2 segundos.</w:t>
             </w:r>
           </w:p>
         </w:tc>
@@ -12750,7 +13274,7 @@
               <w:rPr>
                 <w:b/>
               </w:rPr>
-              <w:t>Rendimiento</w:t>
+              <w:t>Frecuencia</w:t>
             </w:r>
           </w:p>
         </w:tc>
@@ -12784,7 +13308,7 @@
                 <w:szCs w:val="23"/>
                 <w:shd w:val="clear" w:color="auto" w:fill="FFFFFF"/>
               </w:rPr>
-              <w:t>La autenticación debe completarse en menos de 2 segundos.</w:t>
+              <w:t>Media de 1-2 veces al día.</w:t>
             </w:r>
           </w:p>
         </w:tc>
@@ -12823,7 +13347,7 @@
               <w:rPr>
                 <w:b/>
               </w:rPr>
-              <w:t>Frecuencia</w:t>
+              <w:t>Importancia</w:t>
             </w:r>
           </w:p>
         </w:tc>
@@ -12849,15 +13373,20 @@
                 <w:between w:val="nil"/>
               </w:pBdr>
               <w:spacing w:line="240" w:lineRule="auto"/>
-            </w:pPr>
-            <w:r>
-              <w:rPr>
-                <w:color w:val="0F1115"/>
-                <w:sz w:val="23"/>
-                <w:szCs w:val="23"/>
-                <w:shd w:val="clear" w:color="auto" w:fill="FFFFFF"/>
-              </w:rPr>
-              <w:t>Este caso de uso se espera que se lleve a cabo una media de 1-2 veces al día por estudiante</w:t>
+              <w:rPr>
+                <w:b/>
+                <w:bCs/>
+              </w:rPr>
+            </w:pPr>
+            <w:r>
+              <w:rPr>
+                <w:rStyle w:val="Fuerte"/>
+                <w:color w:val="0F1115"/>
+                <w:sz w:val="23"/>
+                <w:szCs w:val="23"/>
+                <w:shd w:val="clear" w:color="auto" w:fill="FFFFFF"/>
+              </w:rPr>
+              <w:t>Importante</w:t>
             </w:r>
           </w:p>
         </w:tc>
@@ -12896,7 +13425,7 @@
               <w:rPr>
                 <w:b/>
               </w:rPr>
-              <w:t>Importancia</w:t>
+              <w:t>Urgencia</w:t>
             </w:r>
           </w:p>
         </w:tc>
@@ -12935,7 +13464,7 @@
                 <w:szCs w:val="23"/>
                 <w:shd w:val="clear" w:color="auto" w:fill="FFFFFF"/>
               </w:rPr>
-              <w:t>Importante</w:t>
+              <w:t>Inmediatamente</w:t>
             </w:r>
           </w:p>
         </w:tc>
@@ -12973,8 +13502,9 @@
             <w:r>
               <w:rPr>
                 <w:b/>
-              </w:rPr>
-              <w:t>Urgencia</w:t>
+                <w:bCs/>
+              </w:rPr>
+              <w:t>Comentarios</w:t>
             </w:r>
           </w:p>
         </w:tc>
@@ -13001,19 +13531,153 @@
               </w:pBdr>
               <w:spacing w:line="240" w:lineRule="auto"/>
               <w:rPr>
+                <w:rStyle w:val="Fuerte"/>
+                <w:b w:val="0"/>
+                <w:bCs w:val="0"/>
+                <w:color w:val="0F1115"/>
+                <w:sz w:val="23"/>
+                <w:szCs w:val="23"/>
+                <w:shd w:val="clear" w:color="auto" w:fill="FFFFFF"/>
+              </w:rPr>
+            </w:pPr>
+            <w:r>
+              <w:rPr>
+                <w:color w:val="0F1115"/>
+                <w:sz w:val="23"/>
+                <w:szCs w:val="23"/>
+                <w:shd w:val="clear" w:color="auto" w:fill="FFFFFF"/>
+              </w:rPr>
+              <w:t xml:space="preserve">El flujo de </w:t>
+            </w:r>
+            <w:proofErr w:type="spellStart"/>
+            <w:r>
+              <w:rPr>
+                <w:color w:val="0F1115"/>
+                <w:sz w:val="23"/>
+                <w:szCs w:val="23"/>
+                <w:shd w:val="clear" w:color="auto" w:fill="FFFFFF"/>
+              </w:rPr>
+              <w:t>login</w:t>
+            </w:r>
+            <w:proofErr w:type="spellEnd"/>
+            <w:r>
+              <w:rPr>
+                <w:color w:val="0F1115"/>
+                <w:sz w:val="23"/>
+                <w:szCs w:val="23"/>
+                <w:shd w:val="clear" w:color="auto" w:fill="FFFFFF"/>
+              </w:rPr>
+              <w:t xml:space="preserve"> es unificado. Las funcionalidades de "Horario Personal" y "Consulta de Torneos" (CU08 y CU09) que se mencionan a continuación están planteadas en los casos de uso originales, pero </w:t>
+            </w:r>
+            <w:r>
+              <w:rPr>
                 <w:b/>
                 <w:bCs/>
-              </w:rPr>
-            </w:pPr>
-            <w:r>
-              <w:rPr>
-                <w:rStyle w:val="Fuerte"/>
-                <w:color w:val="0F1115"/>
-                <w:sz w:val="23"/>
-                <w:szCs w:val="23"/>
-                <w:shd w:val="clear" w:color="auto" w:fill="FFFFFF"/>
-              </w:rPr>
-              <w:t>Inmediatamente</w:t>
+                <w:color w:val="0F1115"/>
+                <w:sz w:val="23"/>
+                <w:szCs w:val="23"/>
+                <w:shd w:val="clear" w:color="auto" w:fill="FFFFFF"/>
+              </w:rPr>
+              <w:t>no están implementadas en el código actual</w:t>
+            </w:r>
+            <w:r>
+              <w:rPr>
+                <w:color w:val="0F1115"/>
+                <w:sz w:val="23"/>
+                <w:szCs w:val="23"/>
+                <w:shd w:val="clear" w:color="auto" w:fill="FFFFFF"/>
+              </w:rPr>
+              <w:t xml:space="preserve">. El </w:t>
+            </w:r>
+            <w:proofErr w:type="spellStart"/>
+            <w:r>
+              <w:rPr>
+                <w:color w:val="0F1115"/>
+                <w:sz w:val="23"/>
+                <w:szCs w:val="23"/>
+                <w:shd w:val="clear" w:color="auto" w:fill="FFFFFF"/>
+              </w:rPr>
+              <w:t>backend</w:t>
+            </w:r>
+            <w:proofErr w:type="spellEnd"/>
+            <w:r>
+              <w:rPr>
+                <w:color w:val="0F1115"/>
+                <w:sz w:val="23"/>
+                <w:szCs w:val="23"/>
+                <w:shd w:val="clear" w:color="auto" w:fill="FFFFFF"/>
+              </w:rPr>
+              <w:t xml:space="preserve"> no tiene </w:t>
+            </w:r>
+            <w:proofErr w:type="spellStart"/>
+            <w:r>
+              <w:rPr>
+                <w:color w:val="0F1115"/>
+                <w:sz w:val="23"/>
+                <w:szCs w:val="23"/>
+                <w:shd w:val="clear" w:color="auto" w:fill="FFFFFF"/>
+              </w:rPr>
+              <w:t>endpoints</w:t>
+            </w:r>
+            <w:proofErr w:type="spellEnd"/>
+            <w:r>
+              <w:rPr>
+                <w:color w:val="0F1115"/>
+                <w:sz w:val="23"/>
+                <w:szCs w:val="23"/>
+                <w:shd w:val="clear" w:color="auto" w:fill="FFFFFF"/>
+              </w:rPr>
+              <w:t xml:space="preserve"> para que un estudiante consulte su horario o torneos </w:t>
+            </w:r>
+            <w:r>
+              <w:rPr>
+                <w:color w:val="0F1115"/>
+                <w:sz w:val="23"/>
+                <w:szCs w:val="23"/>
+                <w:shd w:val="clear" w:color="auto" w:fill="FFFFFF"/>
+              </w:rPr>
+              <w:lastRenderedPageBreak/>
+              <w:t>específicos basados en su </w:t>
+            </w:r>
+            <w:proofErr w:type="spellStart"/>
+            <w:r>
+              <w:rPr>
+                <w:color w:val="0F1115"/>
+                <w:sz w:val="23"/>
+                <w:szCs w:val="23"/>
+                <w:shd w:val="clear" w:color="auto" w:fill="FFFFFF"/>
+              </w:rPr>
+              <w:t>student_id</w:t>
+            </w:r>
+            <w:proofErr w:type="spellEnd"/>
+            <w:r>
+              <w:rPr>
+                <w:color w:val="0F1115"/>
+                <w:sz w:val="23"/>
+                <w:szCs w:val="23"/>
+                <w:shd w:val="clear" w:color="auto" w:fill="FFFFFF"/>
+              </w:rPr>
+              <w:t> o </w:t>
+            </w:r>
+            <w:proofErr w:type="spellStart"/>
+            <w:r>
+              <w:rPr>
+                <w:color w:val="0F1115"/>
+                <w:sz w:val="23"/>
+                <w:szCs w:val="23"/>
+                <w:shd w:val="clear" w:color="auto" w:fill="FFFFFF"/>
+              </w:rPr>
+              <w:t>category_id</w:t>
+            </w:r>
+            <w:proofErr w:type="spellEnd"/>
+            <w:r>
+              <w:rPr>
+                <w:color w:val="0F1115"/>
+                <w:sz w:val="23"/>
+                <w:szCs w:val="23"/>
+                <w:shd w:val="clear" w:color="auto" w:fill="FFFFFF"/>
+              </w:rPr>
+              <w:t>. Solo se listan todos los horarios o torneos sin filtrar por categoría del usuario.</w:t>
             </w:r>
           </w:p>
         </w:tc>
@@ -13036,7 +13700,7 @@
     <w:p/>
     <w:tbl>
       <w:tblPr>
-        <w:tblpPr w:leftFromText="141" w:rightFromText="141" w:vertAnchor="page" w:horzAnchor="page" w:tblpX="1139" w:tblpY="3614"/>
+        <w:tblpPr w:leftFromText="141" w:rightFromText="141" w:vertAnchor="page" w:horzAnchor="margin" w:tblpY="348"/>
         <w:tblOverlap w:val="never"/>
         <w:tblW w:w="11100" w:type="dxa"/>
         <w:tblBorders>
@@ -13194,6 +13858,8 @@
             </w:pPr>
             <w:r>
               <w:rPr>
+                <w:b/>
+                <w:bCs/>
                 <w:color w:val="0F1115"/>
                 <w:sz w:val="23"/>
                 <w:szCs w:val="23"/>
@@ -13204,6 +13870,8 @@
             <w:proofErr w:type="spellStart"/>
             <w:r>
               <w:rPr>
+                <w:b/>
+                <w:bCs/>
                 <w:color w:val="0F1115"/>
                 <w:sz w:val="23"/>
                 <w:szCs w:val="23"/>
@@ -13214,12 +13882,107 @@
             <w:proofErr w:type="spellEnd"/>
             <w:r>
               <w:rPr>
-                <w:color w:val="0F1115"/>
-                <w:sz w:val="23"/>
-                <w:szCs w:val="23"/>
-                <w:shd w:val="clear" w:color="auto" w:fill="FFFFFF"/>
-              </w:rPr>
-              <w:t xml:space="preserve"> visualiza el horario de entrenamiento de su categoría con días, horas y canchas asignadas.</w:t>
+                <w:b/>
+                <w:bCs/>
+                <w:color w:val="0F1115"/>
+                <w:sz w:val="23"/>
+                <w:szCs w:val="23"/>
+                <w:shd w:val="clear" w:color="auto" w:fill="FFFFFF"/>
+              </w:rPr>
+              <w:t xml:space="preserve"> visualiza el horario de entrenamiento de su categoría. No implementado.</w:t>
+            </w:r>
+          </w:p>
+        </w:tc>
+      </w:tr>
+      <w:tr>
+        <w:trPr>
+          <w:trHeight w:val="184"/>
+        </w:trPr>
+        <w:tc>
+          <w:tcPr>
+            <w:tcW w:w="1770" w:type="dxa"/>
+            <w:shd w:val="clear" w:color="auto" w:fill="FFF2CC"/>
+            <w:tcMar>
+              <w:top w:w="100" w:type="dxa"/>
+              <w:left w:w="100" w:type="dxa"/>
+              <w:bottom w:w="100" w:type="dxa"/>
+              <w:right w:w="100" w:type="dxa"/>
+            </w:tcMar>
+          </w:tcPr>
+          <w:p>
+            <w:pPr>
+              <w:widowControl w:val="0"/>
+              <w:pBdr>
+                <w:top w:val="nil"/>
+                <w:left w:val="nil"/>
+                <w:bottom w:val="nil"/>
+                <w:right w:val="nil"/>
+                <w:between w:val="nil"/>
+              </w:pBdr>
+              <w:spacing w:line="240" w:lineRule="auto"/>
+              <w:rPr>
+                <w:b/>
+              </w:rPr>
+            </w:pPr>
+            <w:r>
+              <w:rPr>
+                <w:b/>
+              </w:rPr>
+              <w:t>Actores</w:t>
+            </w:r>
+          </w:p>
+        </w:tc>
+        <w:tc>
+          <w:tcPr>
+            <w:tcW w:w="9330" w:type="dxa"/>
+            <w:gridSpan w:val="3"/>
+            <w:tcMar>
+              <w:top w:w="100" w:type="dxa"/>
+              <w:left w:w="100" w:type="dxa"/>
+              <w:bottom w:w="100" w:type="dxa"/>
+              <w:right w:w="100" w:type="dxa"/>
+            </w:tcMar>
+          </w:tcPr>
+          <w:p>
+            <w:pPr>
+              <w:widowControl w:val="0"/>
+              <w:pBdr>
+                <w:top w:val="nil"/>
+                <w:left w:val="nil"/>
+                <w:bottom w:val="nil"/>
+                <w:right w:val="nil"/>
+                <w:between w:val="nil"/>
+              </w:pBdr>
+              <w:spacing w:line="240" w:lineRule="auto"/>
+            </w:pPr>
+            <w:r>
+              <w:rPr>
+                <w:color w:val="0F1115"/>
+                <w:sz w:val="23"/>
+                <w:szCs w:val="23"/>
+                <w:shd w:val="clear" w:color="auto" w:fill="FFFFFF"/>
+              </w:rPr>
+              <w:t>Estudiante (</w:t>
+            </w:r>
+            <w:proofErr w:type="spellStart"/>
+            <w:r>
+              <w:rPr>
+                <w:color w:val="0F1115"/>
+                <w:sz w:val="23"/>
+                <w:szCs w:val="23"/>
+                <w:shd w:val="clear" w:color="auto" w:fill="FFFFFF"/>
+              </w:rPr>
+              <w:t>user</w:t>
+            </w:r>
+            <w:proofErr w:type="spellEnd"/>
+            <w:r>
+              <w:rPr>
+                <w:color w:val="0F1115"/>
+                <w:sz w:val="23"/>
+                <w:szCs w:val="23"/>
+                <w:shd w:val="clear" w:color="auto" w:fill="FFFFFF"/>
+              </w:rPr>
+              <w:t>)</w:t>
             </w:r>
           </w:p>
         </w:tc>
@@ -13258,7 +14021,29 @@
               <w:rPr>
                 <w:b/>
               </w:rPr>
-              <w:t>Actores</w:t>
+              <w:t>Pre</w:t>
+            </w:r>
+          </w:p>
+          <w:p>
+            <w:pPr>
+              <w:widowControl w:val="0"/>
+              <w:pBdr>
+                <w:top w:val="nil"/>
+                <w:left w:val="nil"/>
+                <w:bottom w:val="nil"/>
+                <w:right w:val="nil"/>
+                <w:between w:val="nil"/>
+              </w:pBdr>
+              <w:spacing w:line="240" w:lineRule="auto"/>
+              <w:rPr>
+                <w:b/>
+              </w:rPr>
+            </w:pPr>
+            <w:r>
+              <w:rPr>
+                <w:b/>
+              </w:rPr>
+              <w:t>condiciones</w:t>
             </w:r>
           </w:p>
         </w:tc>
@@ -13292,7 +14077,37 @@
                 <w:szCs w:val="23"/>
                 <w:shd w:val="clear" w:color="auto" w:fill="FFFFFF"/>
               </w:rPr>
-              <w:t>Estudiante</w:t>
+              <w:t>1. El estudiante ha iniciado sesión.</w:t>
+            </w:r>
+            <w:r>
+              <w:rPr>
+                <w:color w:val="0F1115"/>
+                <w:sz w:val="23"/>
+                <w:szCs w:val="23"/>
+                <w:shd w:val="clear" w:color="auto" w:fill="FFFFFF"/>
+              </w:rPr>
+              <w:br/>
+              <w:t>2. El administrador ha asignado horarios a su categoría (</w:t>
+            </w:r>
+            <w:proofErr w:type="spellStart"/>
+            <w:r>
+              <w:rPr>
+                <w:color w:val="0F1115"/>
+                <w:sz w:val="23"/>
+                <w:szCs w:val="23"/>
+                <w:shd w:val="clear" w:color="auto" w:fill="FFFFFF"/>
+              </w:rPr>
+              <w:t>schedules</w:t>
+            </w:r>
+            <w:proofErr w:type="spellEnd"/>
+            <w:r>
+              <w:rPr>
+                <w:color w:val="0F1115"/>
+                <w:sz w:val="23"/>
+                <w:szCs w:val="23"/>
+                <w:shd w:val="clear" w:color="auto" w:fill="FFFFFF"/>
+              </w:rPr>
+              <w:t>).</w:t>
             </w:r>
           </w:p>
         </w:tc>
@@ -13331,29 +14146,7 @@
               <w:rPr>
                 <w:b/>
               </w:rPr>
-              <w:t>Pre</w:t>
-            </w:r>
-          </w:p>
-          <w:p>
-            <w:pPr>
-              <w:widowControl w:val="0"/>
-              <w:pBdr>
-                <w:top w:val="nil"/>
-                <w:left w:val="nil"/>
-                <w:bottom w:val="nil"/>
-                <w:right w:val="nil"/>
-                <w:between w:val="nil"/>
-              </w:pBdr>
-              <w:spacing w:line="240" w:lineRule="auto"/>
-              <w:rPr>
-                <w:b/>
-              </w:rPr>
-            </w:pPr>
-            <w:r>
-              <w:rPr>
-                <w:b/>
-              </w:rPr>
-              <w:t>condiciones</w:t>
+              <w:t>Post condiciones</w:t>
             </w:r>
           </w:p>
         </w:tc>
@@ -13371,40 +14164,36 @@
           <w:p>
             <w:pPr>
               <w:widowControl w:val="0"/>
-              <w:pBdr>
-                <w:top w:val="nil"/>
-                <w:left w:val="nil"/>
-                <w:bottom w:val="nil"/>
-                <w:right w:val="nil"/>
-                <w:between w:val="nil"/>
-              </w:pBdr>
-              <w:spacing w:line="240" w:lineRule="auto"/>
-            </w:pPr>
-            <w:r>
-              <w:rPr>
-                <w:color w:val="0F1115"/>
-                <w:sz w:val="23"/>
-                <w:szCs w:val="23"/>
-                <w:shd w:val="clear" w:color="auto" w:fill="FFFFFF"/>
-              </w:rPr>
-              <w:t>1. El estudiante ha iniciado sesión.</w:t>
-            </w:r>
-            <w:r>
-              <w:rPr>
-                <w:color w:val="0F1115"/>
-                <w:sz w:val="23"/>
-                <w:szCs w:val="23"/>
-              </w:rPr>
-              <w:br/>
-            </w:r>
-            <w:r>
-              <w:rPr>
-                <w:color w:val="0F1115"/>
-                <w:sz w:val="23"/>
-                <w:szCs w:val="23"/>
-                <w:shd w:val="clear" w:color="auto" w:fill="FFFFFF"/>
-              </w:rPr>
-              <w:t>2. El administrador ha asignado horarios a su categoría.</w:t>
+              <w:spacing w:line="240" w:lineRule="auto"/>
+            </w:pPr>
+            <w:r>
+              <w:rPr>
+                <w:color w:val="0F1115"/>
+                <w:sz w:val="23"/>
+                <w:szCs w:val="23"/>
+                <w:shd w:val="clear" w:color="auto" w:fill="FFFFFF"/>
+              </w:rPr>
+              <w:t>1. El estudiante visualiza su horario semanal filtrado por su </w:t>
+            </w:r>
+            <w:proofErr w:type="spellStart"/>
+            <w:r>
+              <w:rPr>
+                <w:color w:val="0F1115"/>
+                <w:sz w:val="23"/>
+                <w:szCs w:val="23"/>
+                <w:shd w:val="clear" w:color="auto" w:fill="FFFFFF"/>
+              </w:rPr>
+              <w:t>category_id</w:t>
+            </w:r>
+            <w:proofErr w:type="spellEnd"/>
+            <w:r>
+              <w:rPr>
+                <w:color w:val="0F1115"/>
+                <w:sz w:val="23"/>
+                <w:szCs w:val="23"/>
+                <w:shd w:val="clear" w:color="auto" w:fill="FFFFFF"/>
+              </w:rPr>
+              <w:t>.</w:t>
             </w:r>
           </w:p>
         </w:tc>
@@ -13416,6 +14205,7 @@
         <w:tc>
           <w:tcPr>
             <w:tcW w:w="1770" w:type="dxa"/>
+            <w:vMerge w:val="restart"/>
             <w:shd w:val="clear" w:color="auto" w:fill="FFF2CC"/>
             <w:tcMar>
               <w:top w:w="100" w:type="dxa"/>
@@ -13443,51 +14233,95 @@
               <w:rPr>
                 <w:b/>
               </w:rPr>
-              <w:t>Post condiciones</w:t>
-            </w:r>
-          </w:p>
-        </w:tc>
-        <w:tc>
-          <w:tcPr>
-            <w:tcW w:w="9330" w:type="dxa"/>
-            <w:gridSpan w:val="3"/>
-            <w:tcMar>
-              <w:top w:w="100" w:type="dxa"/>
-              <w:left w:w="100" w:type="dxa"/>
-              <w:bottom w:w="100" w:type="dxa"/>
-              <w:right w:w="100" w:type="dxa"/>
-            </w:tcMar>
-          </w:tcPr>
-          <w:p>
-            <w:pPr>
-              <w:widowControl w:val="0"/>
-              <w:spacing w:line="240" w:lineRule="auto"/>
-            </w:pPr>
-            <w:r>
-              <w:rPr>
-                <w:color w:val="0F1115"/>
-                <w:sz w:val="23"/>
-                <w:szCs w:val="23"/>
-                <w:shd w:val="clear" w:color="auto" w:fill="FFFFFF"/>
-              </w:rPr>
-              <w:t>1. El estudiante visualiza su horario semanal.</w:t>
-            </w:r>
-            <w:r>
-              <w:rPr>
-                <w:color w:val="0F1115"/>
-                <w:sz w:val="23"/>
-                <w:szCs w:val="23"/>
-              </w:rPr>
-              <w:br/>
-            </w:r>
-            <w:r>
-              <w:rPr>
-                <w:color w:val="0F1115"/>
-                <w:sz w:val="23"/>
-                <w:szCs w:val="23"/>
-                <w:shd w:val="clear" w:color="auto" w:fill="FFFFFF"/>
-              </w:rPr>
-              <w:t>2. Puede filtrar por semana actual/siguiente.</w:t>
+              <w:t>Secuencia Normal</w:t>
+            </w:r>
+          </w:p>
+        </w:tc>
+        <w:tc>
+          <w:tcPr>
+            <w:tcW w:w="450" w:type="dxa"/>
+            <w:shd w:val="clear" w:color="auto" w:fill="D9EAD3"/>
+            <w:tcMar>
+              <w:top w:w="100" w:type="dxa"/>
+              <w:left w:w="100" w:type="dxa"/>
+              <w:bottom w:w="100" w:type="dxa"/>
+              <w:right w:w="100" w:type="dxa"/>
+            </w:tcMar>
+          </w:tcPr>
+          <w:p>
+            <w:pPr>
+              <w:widowControl w:val="0"/>
+              <w:pBdr>
+                <w:top w:val="nil"/>
+                <w:left w:val="nil"/>
+                <w:bottom w:val="nil"/>
+                <w:right w:val="nil"/>
+                <w:between w:val="nil"/>
+              </w:pBdr>
+              <w:spacing w:line="240" w:lineRule="auto"/>
+              <w:rPr>
+                <w:b/>
+              </w:rPr>
+            </w:pPr>
+            <w:r>
+              <w:rPr>
+                <w:b/>
+              </w:rPr>
+              <w:t>#</w:t>
+            </w:r>
+          </w:p>
+        </w:tc>
+        <w:tc>
+          <w:tcPr>
+            <w:tcW w:w="4200" w:type="dxa"/>
+            <w:shd w:val="clear" w:color="auto" w:fill="D9EAD3"/>
+            <w:tcMar>
+              <w:top w:w="100" w:type="dxa"/>
+              <w:left w:w="100" w:type="dxa"/>
+              <w:bottom w:w="100" w:type="dxa"/>
+              <w:right w:w="100" w:type="dxa"/>
+            </w:tcMar>
+          </w:tcPr>
+          <w:p>
+            <w:pPr>
+              <w:widowControl w:val="0"/>
+              <w:spacing w:line="240" w:lineRule="auto"/>
+              <w:rPr>
+                <w:b/>
+              </w:rPr>
+            </w:pPr>
+            <w:r>
+              <w:rPr>
+                <w:b/>
+              </w:rPr>
+              <w:t>Acción (actor)</w:t>
+            </w:r>
+          </w:p>
+        </w:tc>
+        <w:tc>
+          <w:tcPr>
+            <w:tcW w:w="4680" w:type="dxa"/>
+            <w:shd w:val="clear" w:color="auto" w:fill="D9EAD3"/>
+            <w:tcMar>
+              <w:top w:w="100" w:type="dxa"/>
+              <w:left w:w="100" w:type="dxa"/>
+              <w:bottom w:w="100" w:type="dxa"/>
+              <w:right w:w="100" w:type="dxa"/>
+            </w:tcMar>
+          </w:tcPr>
+          <w:p>
+            <w:pPr>
+              <w:widowControl w:val="0"/>
+              <w:spacing w:line="240" w:lineRule="auto"/>
+              <w:rPr>
+                <w:b/>
+              </w:rPr>
+            </w:pPr>
+            <w:r>
+              <w:rPr>
+                <w:b/>
+              </w:rPr>
+              <w:t>Reacción (sistema)</w:t>
             </w:r>
           </w:p>
         </w:tc>
@@ -13499,7 +14333,7 @@
         <w:tc>
           <w:tcPr>
             <w:tcW w:w="1770" w:type="dxa"/>
-            <w:vMerge w:val="restart"/>
+            <w:vMerge/>
             <w:shd w:val="clear" w:color="auto" w:fill="FFF2CC"/>
             <w:tcMar>
               <w:top w:w="100" w:type="dxa"/>
@@ -13519,103 +14353,99 @@
                 <w:between w:val="nil"/>
               </w:pBdr>
               <w:spacing w:line="240" w:lineRule="auto"/>
-              <w:rPr>
-                <w:b/>
-              </w:rPr>
-            </w:pPr>
-            <w:r>
-              <w:rPr>
-                <w:b/>
-              </w:rPr>
-              <w:t>Secuencia Normal</w:t>
-            </w:r>
+            </w:pPr>
           </w:p>
         </w:tc>
         <w:tc>
           <w:tcPr>
             <w:tcW w:w="450" w:type="dxa"/>
-            <w:shd w:val="clear" w:color="auto" w:fill="D9EAD3"/>
-            <w:tcMar>
-              <w:top w:w="100" w:type="dxa"/>
-              <w:left w:w="100" w:type="dxa"/>
-              <w:bottom w:w="100" w:type="dxa"/>
-              <w:right w:w="100" w:type="dxa"/>
-            </w:tcMar>
-          </w:tcPr>
-          <w:p>
-            <w:pPr>
-              <w:widowControl w:val="0"/>
-              <w:pBdr>
-                <w:top w:val="nil"/>
-                <w:left w:val="nil"/>
-                <w:bottom w:val="nil"/>
-                <w:right w:val="nil"/>
-                <w:between w:val="nil"/>
-              </w:pBdr>
-              <w:spacing w:line="240" w:lineRule="auto"/>
-              <w:rPr>
-                <w:b/>
-              </w:rPr>
-            </w:pPr>
-            <w:r>
-              <w:rPr>
-                <w:b/>
-              </w:rPr>
-              <w:t>#</w:t>
+            <w:tcMar>
+              <w:top w:w="100" w:type="dxa"/>
+              <w:left w:w="100" w:type="dxa"/>
+              <w:bottom w:w="100" w:type="dxa"/>
+              <w:right w:w="100" w:type="dxa"/>
+            </w:tcMar>
+          </w:tcPr>
+          <w:p>
+            <w:pPr>
+              <w:widowControl w:val="0"/>
+              <w:pBdr>
+                <w:top w:val="nil"/>
+                <w:left w:val="nil"/>
+                <w:bottom w:val="nil"/>
+                <w:right w:val="nil"/>
+                <w:between w:val="nil"/>
+              </w:pBdr>
+              <w:spacing w:line="240" w:lineRule="auto"/>
+            </w:pPr>
+            <w:r>
+              <w:t>1</w:t>
             </w:r>
           </w:p>
         </w:tc>
         <w:tc>
           <w:tcPr>
             <w:tcW w:w="4200" w:type="dxa"/>
-            <w:shd w:val="clear" w:color="auto" w:fill="D9EAD3"/>
-            <w:tcMar>
-              <w:top w:w="100" w:type="dxa"/>
-              <w:left w:w="100" w:type="dxa"/>
-              <w:bottom w:w="100" w:type="dxa"/>
-              <w:right w:w="100" w:type="dxa"/>
-            </w:tcMar>
-          </w:tcPr>
-          <w:p>
-            <w:pPr>
-              <w:widowControl w:val="0"/>
-              <w:spacing w:line="240" w:lineRule="auto"/>
-              <w:rPr>
-                <w:b/>
-              </w:rPr>
-            </w:pPr>
-            <w:r>
-              <w:rPr>
-                <w:b/>
-              </w:rPr>
-              <w:t>Acción (actor)</w:t>
+            <w:tcMar>
+              <w:top w:w="100" w:type="dxa"/>
+              <w:left w:w="100" w:type="dxa"/>
+              <w:bottom w:w="100" w:type="dxa"/>
+              <w:right w:w="100" w:type="dxa"/>
+            </w:tcMar>
+          </w:tcPr>
+          <w:p>
+            <w:pPr>
+              <w:widowControl w:val="0"/>
+              <w:pBdr>
+                <w:top w:val="nil"/>
+                <w:left w:val="nil"/>
+                <w:bottom w:val="nil"/>
+                <w:right w:val="nil"/>
+                <w:between w:val="nil"/>
+              </w:pBdr>
+              <w:spacing w:line="240" w:lineRule="auto"/>
+            </w:pPr>
+            <w:r>
+              <w:rPr>
+                <w:color w:val="0F1115"/>
+                <w:sz w:val="23"/>
+                <w:szCs w:val="23"/>
+                <w:shd w:val="clear" w:color="auto" w:fill="FFFFFF"/>
+              </w:rPr>
+              <w:t>El estudiante, desde los botones de navegación, selecciona "Mi Horario".</w:t>
             </w:r>
           </w:p>
         </w:tc>
         <w:tc>
           <w:tcPr>
             <w:tcW w:w="4680" w:type="dxa"/>
-            <w:shd w:val="clear" w:color="auto" w:fill="D9EAD3"/>
-            <w:tcMar>
-              <w:top w:w="100" w:type="dxa"/>
-              <w:left w:w="100" w:type="dxa"/>
-              <w:bottom w:w="100" w:type="dxa"/>
-              <w:right w:w="100" w:type="dxa"/>
-            </w:tcMar>
-          </w:tcPr>
-          <w:p>
-            <w:pPr>
-              <w:widowControl w:val="0"/>
-              <w:spacing w:line="240" w:lineRule="auto"/>
-              <w:rPr>
-                <w:b/>
-              </w:rPr>
-            </w:pPr>
-            <w:r>
-              <w:rPr>
-                <w:b/>
-              </w:rPr>
-              <w:t>Reacción (sistema)</w:t>
+            <w:tcMar>
+              <w:top w:w="100" w:type="dxa"/>
+              <w:left w:w="100" w:type="dxa"/>
+              <w:bottom w:w="100" w:type="dxa"/>
+              <w:right w:w="100" w:type="dxa"/>
+            </w:tcMar>
+          </w:tcPr>
+          <w:p>
+            <w:pPr>
+              <w:widowControl w:val="0"/>
+              <w:pBdr>
+                <w:top w:val="nil"/>
+                <w:left w:val="nil"/>
+                <w:bottom w:val="nil"/>
+                <w:right w:val="nil"/>
+                <w:between w:val="nil"/>
+              </w:pBdr>
+              <w:spacing w:line="240" w:lineRule="auto"/>
+            </w:pPr>
+            <w:r>
+              <w:rPr>
+                <w:color w:val="0F1115"/>
+                <w:sz w:val="23"/>
+                <w:szCs w:val="23"/>
+                <w:shd w:val="clear" w:color="auto" w:fill="FFFFFF"/>
+              </w:rPr>
+              <w:t>El sistema detecta automáticamente su categoría y muestra la tabla semanal con días, horas y cancha.</w:t>
             </w:r>
           </w:p>
         </w:tc>
@@ -13673,7 +14503,7 @@
               <w:spacing w:line="240" w:lineRule="auto"/>
             </w:pPr>
             <w:r>
-              <w:t>1</w:t>
+              <w:t>2</w:t>
             </w:r>
           </w:p>
         </w:tc>
@@ -13706,7 +14536,7 @@
                 <w:szCs w:val="23"/>
                 <w:shd w:val="clear" w:color="auto" w:fill="FFFFFF"/>
               </w:rPr>
-              <w:t>El estudiante, desde los botones de navegación, selecciona "Mi Horario".</w:t>
+              <w:t>El estudiante selecciona "Semana siguiente" o "Semana anterior".</w:t>
             </w:r>
           </w:p>
         </w:tc>
@@ -13739,7 +14569,371 @@
                 <w:szCs w:val="23"/>
                 <w:shd w:val="clear" w:color="auto" w:fill="FFFFFF"/>
               </w:rPr>
-              <w:t>El sistema detecta automáticamente su categoría y muestra la tabla semanal con días, horas y cancha.</w:t>
+              <w:t>El sistema actualiza la vista con los horarios de esa semana.</w:t>
+            </w:r>
+          </w:p>
+        </w:tc>
+      </w:tr>
+      <w:tr>
+        <w:tc>
+          <w:tcPr>
+            <w:tcW w:w="1770" w:type="dxa"/>
+            <w:shd w:val="clear" w:color="auto" w:fill="FFF2CC"/>
+            <w:tcMar>
+              <w:top w:w="100" w:type="dxa"/>
+              <w:left w:w="100" w:type="dxa"/>
+              <w:bottom w:w="100" w:type="dxa"/>
+              <w:right w:w="100" w:type="dxa"/>
+            </w:tcMar>
+          </w:tcPr>
+          <w:p>
+            <w:pPr>
+              <w:widowControl w:val="0"/>
+              <w:pBdr>
+                <w:top w:val="nil"/>
+                <w:left w:val="nil"/>
+                <w:bottom w:val="nil"/>
+                <w:right w:val="nil"/>
+                <w:between w:val="nil"/>
+              </w:pBdr>
+              <w:spacing w:line="240" w:lineRule="auto"/>
+              <w:rPr>
+                <w:b/>
+              </w:rPr>
+            </w:pPr>
+            <w:r>
+              <w:rPr>
+                <w:b/>
+              </w:rPr>
+              <w:t>Excepciones</w:t>
+            </w:r>
+          </w:p>
+        </w:tc>
+        <w:tc>
+          <w:tcPr>
+            <w:tcW w:w="450" w:type="dxa"/>
+            <w:shd w:val="clear" w:color="auto" w:fill="D9EAD3"/>
+            <w:tcMar>
+              <w:top w:w="100" w:type="dxa"/>
+              <w:left w:w="100" w:type="dxa"/>
+              <w:bottom w:w="100" w:type="dxa"/>
+              <w:right w:w="100" w:type="dxa"/>
+            </w:tcMar>
+          </w:tcPr>
+          <w:p>
+            <w:pPr>
+              <w:widowControl w:val="0"/>
+              <w:pBdr>
+                <w:top w:val="nil"/>
+                <w:left w:val="nil"/>
+                <w:bottom w:val="nil"/>
+                <w:right w:val="nil"/>
+                <w:between w:val="nil"/>
+              </w:pBdr>
+              <w:spacing w:line="240" w:lineRule="auto"/>
+            </w:pPr>
+            <w:r>
+              <w:t>#</w:t>
+            </w:r>
+          </w:p>
+        </w:tc>
+        <w:tc>
+          <w:tcPr>
+            <w:tcW w:w="4200" w:type="dxa"/>
+            <w:shd w:val="clear" w:color="auto" w:fill="D9EAD3"/>
+            <w:tcMar>
+              <w:top w:w="100" w:type="dxa"/>
+              <w:left w:w="100" w:type="dxa"/>
+              <w:bottom w:w="100" w:type="dxa"/>
+              <w:right w:w="100" w:type="dxa"/>
+            </w:tcMar>
+          </w:tcPr>
+          <w:p>
+            <w:pPr>
+              <w:widowControl w:val="0"/>
+              <w:spacing w:line="240" w:lineRule="auto"/>
+              <w:rPr>
+                <w:b/>
+              </w:rPr>
+            </w:pPr>
+            <w:r>
+              <w:rPr>
+                <w:b/>
+              </w:rPr>
+              <w:t>Acción (actor)</w:t>
+            </w:r>
+          </w:p>
+        </w:tc>
+        <w:tc>
+          <w:tcPr>
+            <w:tcW w:w="4680" w:type="dxa"/>
+            <w:shd w:val="clear" w:color="auto" w:fill="D9EAD3"/>
+            <w:tcMar>
+              <w:top w:w="100" w:type="dxa"/>
+              <w:left w:w="100" w:type="dxa"/>
+              <w:bottom w:w="100" w:type="dxa"/>
+              <w:right w:w="100" w:type="dxa"/>
+            </w:tcMar>
+          </w:tcPr>
+          <w:p>
+            <w:pPr>
+              <w:widowControl w:val="0"/>
+              <w:pBdr>
+                <w:top w:val="nil"/>
+                <w:left w:val="nil"/>
+                <w:bottom w:val="nil"/>
+                <w:right w:val="nil"/>
+                <w:between w:val="nil"/>
+              </w:pBdr>
+              <w:spacing w:line="240" w:lineRule="auto"/>
+              <w:rPr>
+                <w:b/>
+              </w:rPr>
+            </w:pPr>
+            <w:r>
+              <w:rPr>
+                <w:b/>
+              </w:rPr>
+              <w:t>Reacción (sistema)</w:t>
+            </w:r>
+          </w:p>
+        </w:tc>
+      </w:tr>
+      <w:tr>
+        <w:tc>
+          <w:tcPr>
+            <w:tcW w:w="1770" w:type="dxa"/>
+            <w:shd w:val="clear" w:color="auto" w:fill="FFF2CC"/>
+            <w:tcMar>
+              <w:top w:w="100" w:type="dxa"/>
+              <w:left w:w="100" w:type="dxa"/>
+              <w:bottom w:w="100" w:type="dxa"/>
+              <w:right w:w="100" w:type="dxa"/>
+            </w:tcMar>
+          </w:tcPr>
+          <w:p>
+            <w:pPr>
+              <w:widowControl w:val="0"/>
+              <w:pBdr>
+                <w:top w:val="nil"/>
+                <w:left w:val="nil"/>
+                <w:bottom w:val="nil"/>
+                <w:right w:val="nil"/>
+                <w:between w:val="nil"/>
+              </w:pBdr>
+              <w:spacing w:line="240" w:lineRule="auto"/>
+              <w:rPr>
+                <w:b/>
+              </w:rPr>
+            </w:pPr>
+          </w:p>
+        </w:tc>
+        <w:tc>
+          <w:tcPr>
+            <w:tcW w:w="450" w:type="dxa"/>
+            <w:tcMar>
+              <w:top w:w="100" w:type="dxa"/>
+              <w:left w:w="100" w:type="dxa"/>
+              <w:bottom w:w="100" w:type="dxa"/>
+              <w:right w:w="100" w:type="dxa"/>
+            </w:tcMar>
+          </w:tcPr>
+          <w:p>
+            <w:pPr>
+              <w:widowControl w:val="0"/>
+              <w:pBdr>
+                <w:top w:val="nil"/>
+                <w:left w:val="nil"/>
+                <w:bottom w:val="nil"/>
+                <w:right w:val="nil"/>
+                <w:between w:val="nil"/>
+              </w:pBdr>
+              <w:spacing w:line="240" w:lineRule="auto"/>
+            </w:pPr>
+            <w:r>
+              <w:t>p</w:t>
+            </w:r>
+          </w:p>
+        </w:tc>
+        <w:tc>
+          <w:tcPr>
+            <w:tcW w:w="4200" w:type="dxa"/>
+            <w:tcMar>
+              <w:top w:w="100" w:type="dxa"/>
+              <w:left w:w="100" w:type="dxa"/>
+              <w:bottom w:w="100" w:type="dxa"/>
+              <w:right w:w="100" w:type="dxa"/>
+            </w:tcMar>
+          </w:tcPr>
+          <w:p>
+            <w:pPr>
+              <w:widowControl w:val="0"/>
+              <w:spacing w:line="240" w:lineRule="auto"/>
+            </w:pPr>
+            <w:r>
+              <w:rPr>
+                <w:color w:val="0F1115"/>
+                <w:sz w:val="23"/>
+                <w:szCs w:val="23"/>
+                <w:shd w:val="clear" w:color="auto" w:fill="FFFFFF"/>
+              </w:rPr>
+              <w:t>En el caso de que no haya horario asignado a su categoría</w:t>
+            </w:r>
+          </w:p>
+        </w:tc>
+        <w:tc>
+          <w:tcPr>
+            <w:tcW w:w="4680" w:type="dxa"/>
+            <w:tcMar>
+              <w:top w:w="100" w:type="dxa"/>
+              <w:left w:w="100" w:type="dxa"/>
+              <w:bottom w:w="100" w:type="dxa"/>
+              <w:right w:w="100" w:type="dxa"/>
+            </w:tcMar>
+          </w:tcPr>
+          <w:p>
+            <w:pPr>
+              <w:widowControl w:val="0"/>
+              <w:pBdr>
+                <w:top w:val="nil"/>
+                <w:left w:val="nil"/>
+                <w:bottom w:val="nil"/>
+                <w:right w:val="nil"/>
+                <w:between w:val="nil"/>
+              </w:pBdr>
+              <w:spacing w:line="240" w:lineRule="auto"/>
+            </w:pPr>
+            <w:r>
+              <w:rPr>
+                <w:color w:val="0F1115"/>
+                <w:sz w:val="23"/>
+                <w:szCs w:val="23"/>
+                <w:shd w:val="clear" w:color="auto" w:fill="FFFFFF"/>
+              </w:rPr>
+              <w:t>El sistema deberá mostrar: "Horario pendiente por asignar. Consulta con tu profesor.".</w:t>
+            </w:r>
+          </w:p>
+        </w:tc>
+      </w:tr>
+      <w:tr>
+        <w:tc>
+          <w:tcPr>
+            <w:tcW w:w="1770" w:type="dxa"/>
+            <w:shd w:val="clear" w:color="auto" w:fill="FFF2CC"/>
+            <w:tcMar>
+              <w:top w:w="100" w:type="dxa"/>
+              <w:left w:w="100" w:type="dxa"/>
+              <w:bottom w:w="100" w:type="dxa"/>
+              <w:right w:w="100" w:type="dxa"/>
+            </w:tcMar>
+          </w:tcPr>
+          <w:p>
+            <w:pPr>
+              <w:widowControl w:val="0"/>
+              <w:pBdr>
+                <w:top w:val="nil"/>
+                <w:left w:val="nil"/>
+                <w:bottom w:val="nil"/>
+                <w:right w:val="nil"/>
+                <w:between w:val="nil"/>
+              </w:pBdr>
+              <w:spacing w:line="240" w:lineRule="auto"/>
+              <w:rPr>
+                <w:b/>
+              </w:rPr>
+            </w:pPr>
+          </w:p>
+        </w:tc>
+        <w:tc>
+          <w:tcPr>
+            <w:tcW w:w="450" w:type="dxa"/>
+            <w:tcMar>
+              <w:top w:w="100" w:type="dxa"/>
+              <w:left w:w="100" w:type="dxa"/>
+              <w:bottom w:w="100" w:type="dxa"/>
+              <w:right w:w="100" w:type="dxa"/>
+            </w:tcMar>
+          </w:tcPr>
+          <w:p>
+            <w:pPr>
+              <w:widowControl w:val="0"/>
+              <w:pBdr>
+                <w:top w:val="nil"/>
+                <w:left w:val="nil"/>
+                <w:bottom w:val="nil"/>
+                <w:right w:val="nil"/>
+                <w:between w:val="nil"/>
+              </w:pBdr>
+              <w:spacing w:line="240" w:lineRule="auto"/>
+            </w:pPr>
+            <w:r>
+              <w:t>q</w:t>
+            </w:r>
+          </w:p>
+        </w:tc>
+        <w:tc>
+          <w:tcPr>
+            <w:tcW w:w="4200" w:type="dxa"/>
+            <w:tcMar>
+              <w:top w:w="100" w:type="dxa"/>
+              <w:left w:w="100" w:type="dxa"/>
+              <w:bottom w:w="100" w:type="dxa"/>
+              <w:right w:w="100" w:type="dxa"/>
+            </w:tcMar>
+          </w:tcPr>
+          <w:p>
+            <w:pPr>
+              <w:widowControl w:val="0"/>
+              <w:pBdr>
+                <w:top w:val="nil"/>
+                <w:left w:val="nil"/>
+                <w:bottom w:val="nil"/>
+                <w:right w:val="nil"/>
+                <w:between w:val="nil"/>
+              </w:pBdr>
+              <w:spacing w:line="240" w:lineRule="auto"/>
+            </w:pPr>
+            <w:r>
+              <w:rPr>
+                <w:color w:val="0F1115"/>
+                <w:sz w:val="23"/>
+                <w:szCs w:val="23"/>
+                <w:shd w:val="clear" w:color="auto" w:fill="FFFFFF"/>
+              </w:rPr>
+              <w:t>En el caso de que el estudiante no tenga categoría asignada</w:t>
+            </w:r>
+          </w:p>
+        </w:tc>
+        <w:tc>
+          <w:tcPr>
+            <w:tcW w:w="4680" w:type="dxa"/>
+            <w:tcMar>
+              <w:top w:w="100" w:type="dxa"/>
+              <w:left w:w="100" w:type="dxa"/>
+              <w:bottom w:w="100" w:type="dxa"/>
+              <w:right w:w="100" w:type="dxa"/>
+            </w:tcMar>
+          </w:tcPr>
+          <w:p>
+            <w:pPr>
+              <w:widowControl w:val="0"/>
+              <w:pBdr>
+                <w:top w:val="nil"/>
+                <w:left w:val="nil"/>
+                <w:bottom w:val="nil"/>
+                <w:right w:val="nil"/>
+                <w:between w:val="nil"/>
+              </w:pBdr>
+              <w:spacing w:line="240" w:lineRule="auto"/>
+            </w:pPr>
+            <w:r>
+              <w:rPr>
+                <w:color w:val="0F1115"/>
+                <w:sz w:val="23"/>
+                <w:szCs w:val="23"/>
+                <w:shd w:val="clear" w:color="auto" w:fill="FFFFFF"/>
+              </w:rPr>
+              <w:t>El sistema deberá mostrar: "No tienes categoría asignada. Informa a tu profesor".</w:t>
             </w:r>
           </w:p>
         </w:tc>
@@ -13751,7 +14945,6 @@
         <w:tc>
           <w:tcPr>
             <w:tcW w:w="1770" w:type="dxa"/>
-            <w:vMerge/>
             <w:shd w:val="clear" w:color="auto" w:fill="FFF2CC"/>
             <w:tcMar>
               <w:top w:w="100" w:type="dxa"/>
@@ -13771,463 +14964,49 @@
                 <w:between w:val="nil"/>
               </w:pBdr>
               <w:spacing w:line="240" w:lineRule="auto"/>
-            </w:pPr>
-          </w:p>
-        </w:tc>
-        <w:tc>
-          <w:tcPr>
-            <w:tcW w:w="450" w:type="dxa"/>
-            <w:tcMar>
-              <w:top w:w="100" w:type="dxa"/>
-              <w:left w:w="100" w:type="dxa"/>
-              <w:bottom w:w="100" w:type="dxa"/>
-              <w:right w:w="100" w:type="dxa"/>
-            </w:tcMar>
-          </w:tcPr>
-          <w:p>
-            <w:pPr>
-              <w:widowControl w:val="0"/>
-              <w:pBdr>
-                <w:top w:val="nil"/>
-                <w:left w:val="nil"/>
-                <w:bottom w:val="nil"/>
-                <w:right w:val="nil"/>
-                <w:between w:val="nil"/>
-              </w:pBdr>
-              <w:spacing w:line="240" w:lineRule="auto"/>
-            </w:pPr>
-            <w:r>
-              <w:t>2</w:t>
-            </w:r>
-          </w:p>
-        </w:tc>
-        <w:tc>
-          <w:tcPr>
-            <w:tcW w:w="4200" w:type="dxa"/>
-            <w:tcMar>
-              <w:top w:w="100" w:type="dxa"/>
-              <w:left w:w="100" w:type="dxa"/>
-              <w:bottom w:w="100" w:type="dxa"/>
-              <w:right w:w="100" w:type="dxa"/>
-            </w:tcMar>
-          </w:tcPr>
-          <w:p>
-            <w:pPr>
-              <w:widowControl w:val="0"/>
-              <w:pBdr>
-                <w:top w:val="nil"/>
-                <w:left w:val="nil"/>
-                <w:bottom w:val="nil"/>
-                <w:right w:val="nil"/>
-                <w:between w:val="nil"/>
-              </w:pBdr>
-              <w:spacing w:line="240" w:lineRule="auto"/>
-            </w:pPr>
-            <w:r>
-              <w:rPr>
-                <w:color w:val="0F1115"/>
-                <w:sz w:val="23"/>
-                <w:szCs w:val="23"/>
-                <w:shd w:val="clear" w:color="auto" w:fill="FFFFFF"/>
-              </w:rPr>
-              <w:t>El estudiante selecciona "Semana siguiente" o "Semana anterior".</w:t>
-            </w:r>
-          </w:p>
-        </w:tc>
-        <w:tc>
-          <w:tcPr>
-            <w:tcW w:w="4680" w:type="dxa"/>
-            <w:tcMar>
-              <w:top w:w="100" w:type="dxa"/>
-              <w:left w:w="100" w:type="dxa"/>
-              <w:bottom w:w="100" w:type="dxa"/>
-              <w:right w:w="100" w:type="dxa"/>
-            </w:tcMar>
-          </w:tcPr>
-          <w:p>
-            <w:pPr>
-              <w:widowControl w:val="0"/>
-              <w:pBdr>
-                <w:top w:val="nil"/>
-                <w:left w:val="nil"/>
-                <w:bottom w:val="nil"/>
-                <w:right w:val="nil"/>
-                <w:between w:val="nil"/>
-              </w:pBdr>
-              <w:spacing w:line="240" w:lineRule="auto"/>
-            </w:pPr>
-            <w:r>
-              <w:rPr>
-                <w:color w:val="0F1115"/>
-                <w:sz w:val="23"/>
-                <w:szCs w:val="23"/>
-                <w:shd w:val="clear" w:color="auto" w:fill="FFFFFF"/>
-              </w:rPr>
-              <w:t>El sistema actualiza la vista con los horarios de esa semana.</w:t>
-            </w:r>
-          </w:p>
-        </w:tc>
-      </w:tr>
-      <w:tr>
-        <w:tc>
-          <w:tcPr>
-            <w:tcW w:w="1770" w:type="dxa"/>
-            <w:shd w:val="clear" w:color="auto" w:fill="FFF2CC"/>
-            <w:tcMar>
-              <w:top w:w="100" w:type="dxa"/>
-              <w:left w:w="100" w:type="dxa"/>
-              <w:bottom w:w="100" w:type="dxa"/>
-              <w:right w:w="100" w:type="dxa"/>
-            </w:tcMar>
-          </w:tcPr>
-          <w:p>
-            <w:pPr>
-              <w:widowControl w:val="0"/>
-              <w:pBdr>
-                <w:top w:val="nil"/>
-                <w:left w:val="nil"/>
-                <w:bottom w:val="nil"/>
-                <w:right w:val="nil"/>
-                <w:between w:val="nil"/>
-              </w:pBdr>
-              <w:spacing w:line="240" w:lineRule="auto"/>
-              <w:rPr>
-                <w:b/>
-              </w:rPr>
-            </w:pPr>
-            <w:r>
-              <w:rPr>
-                <w:b/>
-              </w:rPr>
-              <w:t>Excepciones</w:t>
-            </w:r>
-          </w:p>
-        </w:tc>
-        <w:tc>
-          <w:tcPr>
-            <w:tcW w:w="450" w:type="dxa"/>
-            <w:shd w:val="clear" w:color="auto" w:fill="D9EAD3"/>
-            <w:tcMar>
-              <w:top w:w="100" w:type="dxa"/>
-              <w:left w:w="100" w:type="dxa"/>
-              <w:bottom w:w="100" w:type="dxa"/>
-              <w:right w:w="100" w:type="dxa"/>
-            </w:tcMar>
-          </w:tcPr>
-          <w:p>
-            <w:pPr>
-              <w:widowControl w:val="0"/>
-              <w:pBdr>
-                <w:top w:val="nil"/>
-                <w:left w:val="nil"/>
-                <w:bottom w:val="nil"/>
-                <w:right w:val="nil"/>
-                <w:between w:val="nil"/>
-              </w:pBdr>
-              <w:spacing w:line="240" w:lineRule="auto"/>
-            </w:pPr>
-            <w:r>
-              <w:t>#</w:t>
-            </w:r>
-          </w:p>
-        </w:tc>
-        <w:tc>
-          <w:tcPr>
-            <w:tcW w:w="4200" w:type="dxa"/>
-            <w:shd w:val="clear" w:color="auto" w:fill="D9EAD3"/>
-            <w:tcMar>
-              <w:top w:w="100" w:type="dxa"/>
-              <w:left w:w="100" w:type="dxa"/>
-              <w:bottom w:w="100" w:type="dxa"/>
-              <w:right w:w="100" w:type="dxa"/>
-            </w:tcMar>
-          </w:tcPr>
-          <w:p>
-            <w:pPr>
-              <w:widowControl w:val="0"/>
-              <w:spacing w:line="240" w:lineRule="auto"/>
-              <w:rPr>
-                <w:b/>
-              </w:rPr>
-            </w:pPr>
-            <w:r>
-              <w:rPr>
-                <w:b/>
-              </w:rPr>
-              <w:t>Acción (actor)</w:t>
-            </w:r>
-          </w:p>
-        </w:tc>
-        <w:tc>
-          <w:tcPr>
-            <w:tcW w:w="4680" w:type="dxa"/>
-            <w:shd w:val="clear" w:color="auto" w:fill="D9EAD3"/>
-            <w:tcMar>
-              <w:top w:w="100" w:type="dxa"/>
-              <w:left w:w="100" w:type="dxa"/>
-              <w:bottom w:w="100" w:type="dxa"/>
-              <w:right w:w="100" w:type="dxa"/>
-            </w:tcMar>
-          </w:tcPr>
-          <w:p>
-            <w:pPr>
-              <w:widowControl w:val="0"/>
-              <w:pBdr>
-                <w:top w:val="nil"/>
-                <w:left w:val="nil"/>
-                <w:bottom w:val="nil"/>
-                <w:right w:val="nil"/>
-                <w:between w:val="nil"/>
-              </w:pBdr>
-              <w:spacing w:line="240" w:lineRule="auto"/>
-              <w:rPr>
-                <w:b/>
-              </w:rPr>
-            </w:pPr>
-            <w:r>
-              <w:rPr>
-                <w:b/>
-              </w:rPr>
-              <w:t>Reacción (sistema)</w:t>
-            </w:r>
-          </w:p>
-        </w:tc>
-      </w:tr>
-      <w:tr>
-        <w:tc>
-          <w:tcPr>
-            <w:tcW w:w="1770" w:type="dxa"/>
-            <w:shd w:val="clear" w:color="auto" w:fill="FFF2CC"/>
-            <w:tcMar>
-              <w:top w:w="100" w:type="dxa"/>
-              <w:left w:w="100" w:type="dxa"/>
-              <w:bottom w:w="100" w:type="dxa"/>
-              <w:right w:w="100" w:type="dxa"/>
-            </w:tcMar>
-          </w:tcPr>
-          <w:p>
-            <w:pPr>
-              <w:widowControl w:val="0"/>
-              <w:pBdr>
-                <w:top w:val="nil"/>
-                <w:left w:val="nil"/>
-                <w:bottom w:val="nil"/>
-                <w:right w:val="nil"/>
-                <w:between w:val="nil"/>
-              </w:pBdr>
-              <w:spacing w:line="240" w:lineRule="auto"/>
-              <w:rPr>
-                <w:b/>
-              </w:rPr>
-            </w:pPr>
-          </w:p>
-        </w:tc>
-        <w:tc>
-          <w:tcPr>
-            <w:tcW w:w="450" w:type="dxa"/>
-            <w:tcMar>
-              <w:top w:w="100" w:type="dxa"/>
-              <w:left w:w="100" w:type="dxa"/>
-              <w:bottom w:w="100" w:type="dxa"/>
-              <w:right w:w="100" w:type="dxa"/>
-            </w:tcMar>
-          </w:tcPr>
-          <w:p>
-            <w:pPr>
-              <w:widowControl w:val="0"/>
-              <w:pBdr>
-                <w:top w:val="nil"/>
-                <w:left w:val="nil"/>
-                <w:bottom w:val="nil"/>
-                <w:right w:val="nil"/>
-                <w:between w:val="nil"/>
-              </w:pBdr>
-              <w:spacing w:line="240" w:lineRule="auto"/>
-            </w:pPr>
-            <w:r>
-              <w:t>p</w:t>
-            </w:r>
-          </w:p>
-        </w:tc>
-        <w:tc>
-          <w:tcPr>
-            <w:tcW w:w="4200" w:type="dxa"/>
-            <w:tcMar>
-              <w:top w:w="100" w:type="dxa"/>
-              <w:left w:w="100" w:type="dxa"/>
-              <w:bottom w:w="100" w:type="dxa"/>
-              <w:right w:w="100" w:type="dxa"/>
-            </w:tcMar>
-          </w:tcPr>
-          <w:p>
-            <w:pPr>
-              <w:widowControl w:val="0"/>
-              <w:spacing w:line="240" w:lineRule="auto"/>
-            </w:pPr>
-            <w:r>
-              <w:rPr>
-                <w:color w:val="0F1115"/>
-                <w:sz w:val="23"/>
-                <w:szCs w:val="23"/>
-                <w:shd w:val="clear" w:color="auto" w:fill="FFFFFF"/>
-              </w:rPr>
-              <w:t>En el caso de que no haya horario asignado a su categoría</w:t>
-            </w:r>
-          </w:p>
-        </w:tc>
-        <w:tc>
-          <w:tcPr>
-            <w:tcW w:w="4680" w:type="dxa"/>
-            <w:tcMar>
-              <w:top w:w="100" w:type="dxa"/>
-              <w:left w:w="100" w:type="dxa"/>
-              <w:bottom w:w="100" w:type="dxa"/>
-              <w:right w:w="100" w:type="dxa"/>
-            </w:tcMar>
-          </w:tcPr>
-          <w:p>
-            <w:pPr>
-              <w:widowControl w:val="0"/>
-              <w:pBdr>
-                <w:top w:val="nil"/>
-                <w:left w:val="nil"/>
-                <w:bottom w:val="nil"/>
-                <w:right w:val="nil"/>
-                <w:between w:val="nil"/>
-              </w:pBdr>
-              <w:spacing w:line="240" w:lineRule="auto"/>
-            </w:pPr>
-            <w:r>
-              <w:rPr>
-                <w:color w:val="0F1115"/>
-                <w:sz w:val="23"/>
-                <w:szCs w:val="23"/>
-                <w:shd w:val="clear" w:color="auto" w:fill="FFFFFF"/>
-              </w:rPr>
-              <w:t>El sistema deberá mostrar: "Horario pendiente por asignar. Consulta con tu profesor.".</w:t>
-            </w:r>
-          </w:p>
-        </w:tc>
-      </w:tr>
-      <w:tr>
-        <w:tc>
-          <w:tcPr>
-            <w:tcW w:w="1770" w:type="dxa"/>
-            <w:shd w:val="clear" w:color="auto" w:fill="FFF2CC"/>
-            <w:tcMar>
-              <w:top w:w="100" w:type="dxa"/>
-              <w:left w:w="100" w:type="dxa"/>
-              <w:bottom w:w="100" w:type="dxa"/>
-              <w:right w:w="100" w:type="dxa"/>
-            </w:tcMar>
-          </w:tcPr>
-          <w:p>
-            <w:pPr>
-              <w:widowControl w:val="0"/>
-              <w:pBdr>
-                <w:top w:val="nil"/>
-                <w:left w:val="nil"/>
-                <w:bottom w:val="nil"/>
-                <w:right w:val="nil"/>
-                <w:between w:val="nil"/>
-              </w:pBdr>
-              <w:spacing w:line="240" w:lineRule="auto"/>
-              <w:rPr>
-                <w:b/>
-              </w:rPr>
-            </w:pPr>
-          </w:p>
-        </w:tc>
-        <w:tc>
-          <w:tcPr>
-            <w:tcW w:w="450" w:type="dxa"/>
-            <w:tcMar>
-              <w:top w:w="100" w:type="dxa"/>
-              <w:left w:w="100" w:type="dxa"/>
-              <w:bottom w:w="100" w:type="dxa"/>
-              <w:right w:w="100" w:type="dxa"/>
-            </w:tcMar>
-          </w:tcPr>
-          <w:p>
-            <w:pPr>
-              <w:widowControl w:val="0"/>
-              <w:pBdr>
-                <w:top w:val="nil"/>
-                <w:left w:val="nil"/>
-                <w:bottom w:val="nil"/>
-                <w:right w:val="nil"/>
-                <w:between w:val="nil"/>
-              </w:pBdr>
-              <w:spacing w:line="240" w:lineRule="auto"/>
-            </w:pPr>
-            <w:r>
-              <w:t>q</w:t>
-            </w:r>
-          </w:p>
-        </w:tc>
-        <w:tc>
-          <w:tcPr>
-            <w:tcW w:w="4200" w:type="dxa"/>
-            <w:tcMar>
-              <w:top w:w="100" w:type="dxa"/>
-              <w:left w:w="100" w:type="dxa"/>
-              <w:bottom w:w="100" w:type="dxa"/>
-              <w:right w:w="100" w:type="dxa"/>
-            </w:tcMar>
-          </w:tcPr>
-          <w:p>
-            <w:pPr>
-              <w:widowControl w:val="0"/>
-              <w:pBdr>
-                <w:top w:val="nil"/>
-                <w:left w:val="nil"/>
-                <w:bottom w:val="nil"/>
-                <w:right w:val="nil"/>
-                <w:between w:val="nil"/>
-              </w:pBdr>
-              <w:spacing w:line="240" w:lineRule="auto"/>
-            </w:pPr>
-            <w:r>
-              <w:rPr>
-                <w:color w:val="0F1115"/>
-                <w:sz w:val="23"/>
-                <w:szCs w:val="23"/>
-                <w:shd w:val="clear" w:color="auto" w:fill="FFFFFF"/>
-              </w:rPr>
-              <w:t>En el caso de que el estudiante no tenga categoría asignada</w:t>
-            </w:r>
-          </w:p>
-        </w:tc>
-        <w:tc>
-          <w:tcPr>
-            <w:tcW w:w="4680" w:type="dxa"/>
-            <w:tcMar>
-              <w:top w:w="100" w:type="dxa"/>
-              <w:left w:w="100" w:type="dxa"/>
-              <w:bottom w:w="100" w:type="dxa"/>
-              <w:right w:w="100" w:type="dxa"/>
-            </w:tcMar>
-          </w:tcPr>
-          <w:p>
-            <w:pPr>
-              <w:widowControl w:val="0"/>
-              <w:pBdr>
-                <w:top w:val="nil"/>
-                <w:left w:val="nil"/>
-                <w:bottom w:val="nil"/>
-                <w:right w:val="nil"/>
-                <w:between w:val="nil"/>
-              </w:pBdr>
-              <w:spacing w:line="240" w:lineRule="auto"/>
-            </w:pPr>
-            <w:r>
-              <w:rPr>
-                <w:color w:val="0F1115"/>
-                <w:sz w:val="23"/>
-                <w:szCs w:val="23"/>
-                <w:shd w:val="clear" w:color="auto" w:fill="FFFFFF"/>
-              </w:rPr>
-              <w:t>El sistema deberá mostrar: "No tienes categoría asignada. Informa a tu profesor".</w:t>
+              <w:rPr>
+                <w:b/>
+              </w:rPr>
+            </w:pPr>
+            <w:r>
+              <w:rPr>
+                <w:b/>
+              </w:rPr>
+              <w:t>Rendimiento</w:t>
+            </w:r>
+          </w:p>
+        </w:tc>
+        <w:tc>
+          <w:tcPr>
+            <w:tcW w:w="9330" w:type="dxa"/>
+            <w:gridSpan w:val="3"/>
+            <w:tcMar>
+              <w:top w:w="100" w:type="dxa"/>
+              <w:left w:w="100" w:type="dxa"/>
+              <w:bottom w:w="100" w:type="dxa"/>
+              <w:right w:w="100" w:type="dxa"/>
+            </w:tcMar>
+          </w:tcPr>
+          <w:p>
+            <w:pPr>
+              <w:widowControl w:val="0"/>
+              <w:pBdr>
+                <w:top w:val="nil"/>
+                <w:left w:val="nil"/>
+                <w:bottom w:val="nil"/>
+                <w:right w:val="nil"/>
+                <w:between w:val="nil"/>
+              </w:pBdr>
+              <w:spacing w:line="240" w:lineRule="auto"/>
+            </w:pPr>
+            <w:r>
+              <w:rPr>
+                <w:color w:val="0F1115"/>
+                <w:sz w:val="23"/>
+                <w:szCs w:val="23"/>
+                <w:shd w:val="clear" w:color="auto" w:fill="FFFFFF"/>
+              </w:rPr>
+              <w:t>La carga debe ser en menos de 2 segundos.</w:t>
             </w:r>
           </w:p>
         </w:tc>
@@ -14266,7 +15045,7 @@
               <w:rPr>
                 <w:b/>
               </w:rPr>
-              <w:t>Rendimiento</w:t>
+              <w:t>Frecuencia</w:t>
             </w:r>
           </w:p>
         </w:tc>
@@ -14300,7 +15079,7 @@
                 <w:szCs w:val="23"/>
                 <w:shd w:val="clear" w:color="auto" w:fill="FFFFFF"/>
               </w:rPr>
-              <w:t>La carga del horario debe ser en menos de 2 segundos.</w:t>
+              <w:t>Este caso de uso se espera que se lleve a cabo una media de 3-4 veces por semana por estudiante.</w:t>
             </w:r>
           </w:p>
         </w:tc>
@@ -14339,7 +15118,7 @@
               <w:rPr>
                 <w:b/>
               </w:rPr>
-              <w:t>Frecuencia</w:t>
+              <w:t>Importancia</w:t>
             </w:r>
           </w:p>
         </w:tc>
@@ -14365,15 +15144,20 @@
                 <w:between w:val="nil"/>
               </w:pBdr>
               <w:spacing w:line="240" w:lineRule="auto"/>
-            </w:pPr>
-            <w:r>
-              <w:rPr>
-                <w:color w:val="0F1115"/>
-                <w:sz w:val="23"/>
-                <w:szCs w:val="23"/>
-                <w:shd w:val="clear" w:color="auto" w:fill="FFFFFF"/>
-              </w:rPr>
-              <w:t>Este caso de uso se espera que se lleve a cabo una media de 3-4 veces por semana por estudiante.</w:t>
+              <w:rPr>
+                <w:b/>
+                <w:bCs/>
+              </w:rPr>
+            </w:pPr>
+            <w:r>
+              <w:rPr>
+                <w:rStyle w:val="Fuerte"/>
+                <w:color w:val="0F1115"/>
+                <w:sz w:val="23"/>
+                <w:szCs w:val="23"/>
+                <w:shd w:val="clear" w:color="auto" w:fill="FFFFFF"/>
+              </w:rPr>
+              <w:t>Importante</w:t>
             </w:r>
           </w:p>
         </w:tc>
@@ -14412,7 +15196,7 @@
               <w:rPr>
                 <w:b/>
               </w:rPr>
-              <w:t>Importancia</w:t>
+              <w:t>Urgencia</w:t>
             </w:r>
           </w:p>
         </w:tc>
@@ -14451,7 +15235,7 @@
                 <w:szCs w:val="23"/>
                 <w:shd w:val="clear" w:color="auto" w:fill="FFFFFF"/>
               </w:rPr>
-              <w:t>Importante</w:t>
+              <w:t>Inmediatamente</w:t>
             </w:r>
           </w:p>
         </w:tc>
@@ -14490,84 +15274,6 @@
               <w:rPr>
                 <w:b/>
               </w:rPr>
-              <w:t>Urgencia</w:t>
-            </w:r>
-          </w:p>
-        </w:tc>
-        <w:tc>
-          <w:tcPr>
-            <w:tcW w:w="9330" w:type="dxa"/>
-            <w:gridSpan w:val="3"/>
-            <w:tcMar>
-              <w:top w:w="100" w:type="dxa"/>
-              <w:left w:w="100" w:type="dxa"/>
-              <w:bottom w:w="100" w:type="dxa"/>
-              <w:right w:w="100" w:type="dxa"/>
-            </w:tcMar>
-          </w:tcPr>
-          <w:p>
-            <w:pPr>
-              <w:widowControl w:val="0"/>
-              <w:pBdr>
-                <w:top w:val="nil"/>
-                <w:left w:val="nil"/>
-                <w:bottom w:val="nil"/>
-                <w:right w:val="nil"/>
-                <w:between w:val="nil"/>
-              </w:pBdr>
-              <w:spacing w:line="240" w:lineRule="auto"/>
-              <w:rPr>
-                <w:b/>
-                <w:bCs/>
-              </w:rPr>
-            </w:pPr>
-            <w:r>
-              <w:rPr>
-                <w:rStyle w:val="Fuerte"/>
-                <w:color w:val="0F1115"/>
-                <w:sz w:val="23"/>
-                <w:szCs w:val="23"/>
-                <w:shd w:val="clear" w:color="auto" w:fill="FFFFFF"/>
-              </w:rPr>
-              <w:t>Inmediatamente</w:t>
-            </w:r>
-          </w:p>
-        </w:tc>
-      </w:tr>
-      <w:tr>
-        <w:trPr>
-          <w:trHeight w:val="420"/>
-        </w:trPr>
-        <w:tc>
-          <w:tcPr>
-            <w:tcW w:w="1770" w:type="dxa"/>
-            <w:shd w:val="clear" w:color="auto" w:fill="FFF2CC"/>
-            <w:tcMar>
-              <w:top w:w="100" w:type="dxa"/>
-              <w:left w:w="100" w:type="dxa"/>
-              <w:bottom w:w="100" w:type="dxa"/>
-              <w:right w:w="100" w:type="dxa"/>
-            </w:tcMar>
-          </w:tcPr>
-          <w:p>
-            <w:pPr>
-              <w:widowControl w:val="0"/>
-              <w:pBdr>
-                <w:top w:val="nil"/>
-                <w:left w:val="nil"/>
-                <w:bottom w:val="nil"/>
-                <w:right w:val="nil"/>
-                <w:between w:val="nil"/>
-              </w:pBdr>
-              <w:spacing w:line="240" w:lineRule="auto"/>
-              <w:rPr>
-                <w:b/>
-              </w:rPr>
-            </w:pPr>
-            <w:r>
-              <w:rPr>
-                <w:b/>
-              </w:rPr>
               <w:t>Comentarios</w:t>
             </w:r>
           </w:p>
@@ -14611,9 +15317,22 @@
     <w:p/>
     <w:p/>
     <w:p/>
+    <w:p/>
+    <w:p/>
+    <w:p/>
+    <w:p/>
+    <w:p/>
+    <w:p/>
+    <w:p/>
+    <w:p/>
+    <w:p/>
+    <w:p/>
+    <w:p/>
+    <w:p/>
+    <w:p/>
     <w:tbl>
       <w:tblPr>
-        <w:tblpPr w:leftFromText="141" w:rightFromText="141" w:vertAnchor="page" w:horzAnchor="margin" w:tblpY="2167"/>
+        <w:tblpPr w:leftFromText="141" w:rightFromText="141" w:vertAnchor="page" w:horzAnchor="margin" w:tblpY="820"/>
         <w:tblW w:w="11100" w:type="dxa"/>
         <w:tblBorders>
           <w:top w:val="single" w:sz="8" w:space="0" w:color="000000"/>
@@ -14666,13 +15385,7 @@
               <w:rPr>
                 <w:b/>
               </w:rPr>
-              <w:t>CU</w:t>
-            </w:r>
-            <w:r>
-              <w:rPr>
-                <w:b/>
-              </w:rPr>
-              <w:t>9</w:t>
+              <w:t>CU9</w:t>
             </w:r>
           </w:p>
         </w:tc>
@@ -14706,6 +15419,7 @@
             <w:r>
               <w:rPr>
                 <w:b/>
+                <w:bCs/>
               </w:rPr>
               <w:t>Consulta de Torneos del Equipo del Estudiante</w:t>
             </w:r>
@@ -14800,7 +15514,18 @@
                 <w:szCs w:val="23"/>
                 <w:shd w:val="clear" w:color="auto" w:fill="FFFFFF"/>
               </w:rPr>
-              <w:t xml:space="preserve"> visualiza los torneos en los que participa su equipo, con fechas, resultados y posición en la tabla.</w:t>
+              <w:t xml:space="preserve"> visualiza los torneos en los que participa su equipo. </w:t>
+            </w:r>
+            <w:r>
+              <w:rPr>
+                <w:b/>
+                <w:bCs/>
+                <w:color w:val="0F1115"/>
+                <w:sz w:val="23"/>
+                <w:szCs w:val="23"/>
+                <w:shd w:val="clear" w:color="auto" w:fill="FFFFFF"/>
+              </w:rPr>
+              <w:t>No implementado.</w:t>
             </w:r>
           </w:p>
         </w:tc>
@@ -14873,7 +15598,27 @@
                 <w:szCs w:val="23"/>
                 <w:shd w:val="clear" w:color="auto" w:fill="FFFFFF"/>
               </w:rPr>
-              <w:t>Estudiante</w:t>
+              <w:t>Estudiante (</w:t>
+            </w:r>
+            <w:proofErr w:type="spellStart"/>
+            <w:r>
+              <w:rPr>
+                <w:color w:val="0F1115"/>
+                <w:sz w:val="23"/>
+                <w:szCs w:val="23"/>
+                <w:shd w:val="clear" w:color="auto" w:fill="FFFFFF"/>
+              </w:rPr>
+              <w:t>user</w:t>
+            </w:r>
+            <w:proofErr w:type="spellEnd"/>
+            <w:r>
+              <w:rPr>
+                <w:color w:val="0F1115"/>
+                <w:sz w:val="23"/>
+                <w:szCs w:val="23"/>
+                <w:shd w:val="clear" w:color="auto" w:fill="FFFFFF"/>
+              </w:rPr>
+              <w:t>)</w:t>
             </w:r>
           </w:p>
         </w:tc>
@@ -14975,17 +15720,10 @@
                 <w:color w:val="0F1115"/>
                 <w:sz w:val="23"/>
                 <w:szCs w:val="23"/>
+                <w:shd w:val="clear" w:color="auto" w:fill="FFFFFF"/>
               </w:rPr>
               <w:br/>
-            </w:r>
-            <w:r>
-              <w:rPr>
-                <w:color w:val="0F1115"/>
-                <w:sz w:val="23"/>
-                <w:szCs w:val="23"/>
-                <w:shd w:val="clear" w:color="auto" w:fill="FFFFFF"/>
-              </w:rPr>
-              <w:t>2. Su equipo está inscrito en al menos un torneo.</w:t>
+              <w:t>2. Su equipo está inscrito en al menos un torneo (no hay modelo de equipos).</w:t>
             </w:r>
           </w:p>
         </w:tc>
@@ -15054,16 +15792,7 @@
                 <w:sz w:val="23"/>
                 <w:szCs w:val="23"/>
               </w:rPr>
-              <w:t>1. El estudiante ve la lista de torneos activos de su equipo.</w:t>
-            </w:r>
-            <w:r>
-              <w:rPr>
-                <w:color w:val="0F1115"/>
-                <w:sz w:val="23"/>
-                <w:szCs w:val="23"/>
-              </w:rPr>
-              <w:br/>
-              <w:t>2. Puede ver detalles resultados.</w:t>
+              <w:t>1. El estudiante ve la lista de torneos filtrados.</w:t>
             </w:r>
           </w:p>
         </w:tc>
@@ -15282,25 +16011,7 @@
                 <w:szCs w:val="23"/>
                 <w:shd w:val="clear" w:color="auto" w:fill="FFFFFF"/>
               </w:rPr>
-              <w:t>El estudiante selecciona "Mis Torneos" desde</w:t>
-            </w:r>
-            <w:r>
-              <w:rPr>
-                <w:color w:val="0F1115"/>
-                <w:sz w:val="23"/>
-                <w:szCs w:val="23"/>
-                <w:shd w:val="clear" w:color="auto" w:fill="FFFFFF"/>
-              </w:rPr>
-              <w:t xml:space="preserve"> los botones de navegación</w:t>
-            </w:r>
-            <w:r>
-              <w:rPr>
-                <w:color w:val="0F1115"/>
-                <w:sz w:val="23"/>
-                <w:szCs w:val="23"/>
-                <w:shd w:val="clear" w:color="auto" w:fill="FFFFFF"/>
-              </w:rPr>
-              <w:t>.</w:t>
+              <w:t>El estudiante selecciona "Mis Torneos" desde los botones de navegación.</w:t>
             </w:r>
           </w:p>
         </w:tc>
@@ -15457,25 +16168,7 @@
                 <w:szCs w:val="23"/>
                 <w:shd w:val="clear" w:color="auto" w:fill="FFFFFF"/>
               </w:rPr>
-              <w:t>El sistema muestra vista detallada: fechas,</w:t>
-            </w:r>
-            <w:r>
-              <w:rPr>
-                <w:color w:val="0F1115"/>
-                <w:sz w:val="23"/>
-                <w:szCs w:val="23"/>
-                <w:shd w:val="clear" w:color="auto" w:fill="FFFFFF"/>
-              </w:rPr>
-              <w:t xml:space="preserve"> Ubicación y Equipos participantes</w:t>
-            </w:r>
-            <w:r>
-              <w:rPr>
-                <w:color w:val="0F1115"/>
-                <w:sz w:val="23"/>
-                <w:szCs w:val="23"/>
-                <w:shd w:val="clear" w:color="auto" w:fill="FFFFFF"/>
-              </w:rPr>
-              <w:t>.</w:t>
+              <w:t>El sistema muestra vista detallada: fechas, Ubicación y Equipos participantes.</w:t>
             </w:r>
           </w:p>
         </w:tc>
@@ -15789,7 +16482,7 @@
                 <w:szCs w:val="23"/>
                 <w:shd w:val="clear" w:color="auto" w:fill="FFFFFF"/>
               </w:rPr>
-              <w:t>La carga de la lista de torneos debe ser en menos de 3 segundos.</w:t>
+              <w:t>La carga de la lista debe ser en menos de 3 segundos.</w:t>
             </w:r>
           </w:p>
         </w:tc>
@@ -15862,7 +16555,7 @@
                 <w:szCs w:val="23"/>
                 <w:shd w:val="clear" w:color="auto" w:fill="FFFFFF"/>
               </w:rPr>
-              <w:t>Este caso de uso se espera que se lleve a cabo una media de 2-3 veces por semana por estudiante.</w:t>
+              <w:t>Media de 2-3 veces por semana.</w:t>
             </w:r>
           </w:p>
         </w:tc>
@@ -16097,7 +16790,6 @@
         </w:tc>
       </w:tr>
     </w:tbl>
-    <w:p/>
     <w:p/>
     <w:sectPr>
       <w:pgSz w:w="12240" w:h="15840"/>

</xml_diff>